<commit_message>
nmv 15 03 2026
</commit_message>
<xml_diff>
--- a/TS-Kramam/TS-4.6/TS 4.6 Malayalam Krama Paatam Corrections.docx
+++ b/TS-Kramam/TS-4.6/TS 4.6 Malayalam Krama Paatam Corrections.docx
@@ -81,7 +81,18 @@
           <w:szCs w:val="32"/>
           <w:u w:val="single"/>
         </w:rPr>
-        <w:t xml:space="preserve">Observed till </w:t>
+        <w:t xml:space="preserve">Observed </w:t>
+      </w:r>
+      <w:proofErr w:type="gramStart"/>
+      <w:r>
+        <w:rPr>
+          <w:b/>
+          <w:bCs/>
+          <w:sz w:val="32"/>
+          <w:szCs w:val="32"/>
+          <w:u w:val="single"/>
+        </w:rPr>
+        <w:t xml:space="preserve">till </w:t>
       </w:r>
       <w:r>
         <w:rPr>
@@ -94,6 +105,7 @@
         </w:rPr>
         <w:t>????</w:t>
       </w:r>
+      <w:proofErr w:type="gramEnd"/>
     </w:p>
     <w:p>
       <w:pPr>
@@ -259,7 +271,7 @@
                 <w:sz w:val="28"/>
                 <w:szCs w:val="32"/>
               </w:rPr>
-              <w:t>3.2</w:t>
+              <w:t>2.5</w:t>
             </w:r>
             <w:r>
               <w:rPr>
@@ -308,7 +320,7 @@
                 <w:szCs w:val="32"/>
                 <w:lang w:val="it-IT"/>
               </w:rPr>
-              <w:t>54</w:t>
+              <w:t>28</w:t>
             </w:r>
           </w:p>
           <w:p>
@@ -367,7 +379,7 @@
                 <w:szCs w:val="32"/>
                 <w:lang w:val="it-IT"/>
               </w:rPr>
-              <w:t>3</w:t>
+              <w:t>0</w:t>
             </w:r>
           </w:p>
         </w:tc>
@@ -383,93 +395,195 @@
               <w:adjustRightInd w:val="0"/>
               <w:spacing w:before="0" w:line="240" w:lineRule="auto"/>
               <w:rPr>
-                <w:rFonts w:ascii="BRH Devanagari Extra" w:hAnsi="BRH Devanagari Extra" w:cs="BRH Devanagari Extra"/>
+                <w:rFonts w:ascii="BRH Malayalam Extra" w:eastAsia="Times New Roman" w:hAnsi="BRH Malayalam Extra" w:cs="BRH Malayalam Extra"/>
+                <w:color w:val="000000"/>
+                <w:sz w:val="40"/>
+                <w:szCs w:val="40"/>
+                <w:lang w:val="en-IN" w:eastAsia="en-IN" w:bidi="ml-IN"/>
+              </w:rPr>
+            </w:pPr>
+            <w:r>
+              <w:rPr>
+                <w:rFonts w:ascii="BRH Malayalam Extra" w:eastAsia="Times New Roman" w:hAnsi="BRH Malayalam Extra" w:cs="BRH Malayalam Extra"/>
+                <w:color w:val="000000"/>
+                <w:sz w:val="40"/>
+                <w:szCs w:val="40"/>
+                <w:lang w:val="en-IN" w:eastAsia="en-IN" w:bidi="ml-IN"/>
+              </w:rPr>
+              <w:t>A</w:t>
+            </w:r>
+            <w:r>
+              <w:rPr>
+                <w:rFonts w:ascii="BRH Malayalam Extra" w:eastAsia="Times New Roman" w:hAnsi="BRH Malayalam Extra" w:cs="BRH Malayalam Extra"/>
+                <w:color w:val="000000"/>
+                <w:sz w:val="32"/>
+                <w:szCs w:val="40"/>
+                <w:lang w:val="en-IN" w:eastAsia="en-IN" w:bidi="ml-IN"/>
+              </w:rPr>
+              <w:t>–</w:t>
+            </w:r>
+            <w:r>
+              <w:rPr>
+                <w:rFonts w:ascii="BRH Malayalam Extra" w:eastAsia="Times New Roman" w:hAnsi="BRH Malayalam Extra" w:cs="BRH Malayalam Extra"/>
+                <w:color w:val="000000"/>
+                <w:sz w:val="40"/>
+                <w:szCs w:val="40"/>
+                <w:lang w:val="en-IN" w:eastAsia="en-IN" w:bidi="ml-IN"/>
+              </w:rPr>
+              <w:t>ÆõZy—rç</w:t>
+            </w:r>
+            <w:r>
+              <w:rPr>
+                <w:rFonts w:ascii="BRH Malayalam Extra" w:eastAsia="Times New Roman" w:hAnsi="BRH Malayalam Extra" w:cs="BRH Malayalam Extra"/>
+                <w:color w:val="000000"/>
+                <w:sz w:val="32"/>
+                <w:szCs w:val="40"/>
+                <w:lang w:val="en-IN" w:eastAsia="en-IN" w:bidi="ml-IN"/>
+              </w:rPr>
+              <w:t>–</w:t>
+            </w:r>
+            <w:r>
+              <w:rPr>
+                <w:rFonts w:ascii="BRH Malayalam Extra" w:eastAsia="Times New Roman" w:hAnsi="BRH Malayalam Extra" w:cs="BRH Malayalam Extra"/>
+                <w:color w:val="000000"/>
+                <w:sz w:val="40"/>
+                <w:szCs w:val="40"/>
+                <w:lang w:val="en-IN" w:eastAsia="en-IN" w:bidi="ml-IN"/>
+              </w:rPr>
+              <w:t xml:space="preserve">b§ h¡p—dxdy | </w:t>
+            </w:r>
+          </w:p>
+          <w:p>
+            <w:pPr>
+              <w:widowControl w:val="0"/>
+              <w:autoSpaceDE w:val="0"/>
+              <w:autoSpaceDN w:val="0"/>
+              <w:adjustRightInd w:val="0"/>
+              <w:spacing w:before="0" w:line="240" w:lineRule="auto"/>
+              <w:rPr>
+                <w:rFonts w:ascii="BRH Malayalam Extra" w:eastAsia="Times New Roman" w:hAnsi="BRH Malayalam Extra" w:cs="BRH Malayalam Extra"/>
+                <w:color w:val="000000"/>
+                <w:sz w:val="40"/>
+                <w:szCs w:val="40"/>
+                <w:lang w:val="en-IN" w:eastAsia="en-IN" w:bidi="ml-IN"/>
+              </w:rPr>
+            </w:pPr>
+            <w:r>
+              <w:rPr>
+                <w:rFonts w:ascii="BRH Malayalam Extra" w:eastAsia="Times New Roman" w:hAnsi="BRH Malayalam Extra" w:cs="BRH Malayalam Extra"/>
+                <w:color w:val="000000"/>
+                <w:sz w:val="40"/>
+                <w:szCs w:val="40"/>
+                <w:lang w:val="en-IN" w:eastAsia="en-IN" w:bidi="ml-IN"/>
+              </w:rPr>
+              <w:t>A</w:t>
+            </w:r>
+            <w:r>
+              <w:rPr>
+                <w:rFonts w:ascii="BRH Malayalam Extra" w:eastAsia="Times New Roman" w:hAnsi="BRH Malayalam Extra" w:cs="BRH Malayalam Extra"/>
+                <w:color w:val="000000"/>
+                <w:sz w:val="32"/>
+                <w:szCs w:val="40"/>
+                <w:lang w:val="en-IN" w:eastAsia="en-IN" w:bidi="ml-IN"/>
+              </w:rPr>
+              <w:t>–</w:t>
+            </w:r>
+            <w:r>
+              <w:rPr>
+                <w:rFonts w:ascii="BRH Malayalam Extra" w:eastAsia="Times New Roman" w:hAnsi="BRH Malayalam Extra" w:cs="BRH Malayalam Extra"/>
+                <w:color w:val="000000"/>
+                <w:sz w:val="40"/>
+                <w:szCs w:val="40"/>
+                <w:lang w:val="en-IN" w:eastAsia="en-IN" w:bidi="ml-IN"/>
+              </w:rPr>
+              <w:t>ÆõZy—rç</w:t>
+            </w:r>
+            <w:r>
+              <w:rPr>
+                <w:rFonts w:ascii="BRH Malayalam Extra" w:eastAsia="Times New Roman" w:hAnsi="BRH Malayalam Extra" w:cs="BRH Malayalam Extra"/>
+                <w:color w:val="000000"/>
+                <w:sz w:val="32"/>
+                <w:szCs w:val="40"/>
+                <w:lang w:val="en-IN" w:eastAsia="en-IN" w:bidi="ml-IN"/>
+              </w:rPr>
+              <w:t>–</w:t>
+            </w:r>
+            <w:r>
+              <w:rPr>
+                <w:rFonts w:ascii="BRH Malayalam Extra" w:eastAsia="Times New Roman" w:hAnsi="BRH Malayalam Extra" w:cs="BRH Malayalam Extra"/>
+                <w:color w:val="000000"/>
+                <w:sz w:val="40"/>
+                <w:szCs w:val="40"/>
+                <w:lang w:val="en-IN" w:eastAsia="en-IN" w:bidi="ml-IN"/>
+              </w:rPr>
+              <w:t>byZõ—</w:t>
+            </w:r>
+            <w:r>
+              <w:rPr>
+                <w:rFonts w:ascii="BRH Malayalam Extra" w:eastAsia="Times New Roman" w:hAnsi="BRH Malayalam Extra" w:cs="BRH Malayalam Extra"/>
                 <w:color w:val="000000"/>
                 <w:sz w:val="40"/>
                 <w:szCs w:val="40"/>
                 <w:highlight w:val="yellow"/>
-              </w:rPr>
-            </w:pPr>
-            <w:r>
-              <w:rPr>
-                <w:rFonts w:ascii="BRH Malayalam Extra" w:eastAsia="Times New Roman" w:hAnsi="BRH Malayalam Extra" w:cs="BRH Malayalam Extra"/>
-                <w:color w:val="000000"/>
-                <w:sz w:val="40"/>
-                <w:szCs w:val="40"/>
-                <w:lang w:val="en-IN" w:eastAsia="en-IN" w:bidi="ml-IN"/>
-              </w:rPr>
-              <w:t>¥Rx¥</w:t>
-            </w:r>
-            <w:r>
-              <w:rPr>
-                <w:rFonts w:ascii="BRH Malayalam Extra" w:eastAsia="Times New Roman" w:hAnsi="BRH Malayalam Extra" w:cs="BRH Malayalam Extra"/>
-                <w:color w:val="000000"/>
-                <w:sz w:val="40"/>
-                <w:szCs w:val="40"/>
-                <w:lang w:val="en-IN" w:eastAsia="en-IN" w:bidi="ml-IN"/>
-              </w:rPr>
-              <w:t>ö</w:t>
-            </w:r>
-            <w:r>
-              <w:rPr>
-                <w:rFonts w:ascii="BRH Malayalam Extra" w:eastAsia="Times New Roman" w:hAnsi="BRH Malayalam Extra" w:cs="BRH Malayalam Extra"/>
-                <w:color w:val="000000"/>
-                <w:sz w:val="40"/>
-                <w:szCs w:val="40"/>
-                <w:highlight w:val="yellow"/>
-                <w:lang w:val="en-IN" w:eastAsia="en-IN" w:bidi="ml-IN"/>
-              </w:rPr>
-              <w:t>r</w:t>
-            </w:r>
-            <w:r>
-              <w:rPr>
-                <w:rFonts w:ascii="BRH Malayalam Extra" w:eastAsia="Times New Roman" w:hAnsi="BRH Malayalam Extra" w:cs="BRH Malayalam Extra"/>
-                <w:color w:val="000000"/>
-                <w:sz w:val="40"/>
-                <w:szCs w:val="40"/>
-                <w:lang w:val="en-IN" w:eastAsia="en-IN" w:bidi="ml-IN"/>
-              </w:rPr>
-              <w:t>æ</w:t>
-            </w:r>
-            <w:r>
-              <w:rPr>
-                <w:rFonts w:ascii="BRH Malayalam Extra" w:eastAsia="Times New Roman" w:hAnsi="BRH Malayalam Extra" w:cs="BRH Malayalam Extra"/>
-                <w:color w:val="000000"/>
-                <w:sz w:val="32"/>
-                <w:szCs w:val="40"/>
-                <w:lang w:val="en-IN" w:eastAsia="en-IN" w:bidi="ml-IN"/>
-              </w:rPr>
-              <w:t>–</w:t>
-            </w:r>
-            <w:r>
-              <w:rPr>
-                <w:rFonts w:ascii="BRH Malayalam Extra" w:eastAsia="Times New Roman" w:hAnsi="BRH Malayalam Extra" w:cs="BRH Malayalam Extra"/>
-                <w:color w:val="000000"/>
-                <w:sz w:val="40"/>
-                <w:szCs w:val="40"/>
-                <w:lang w:val="en-IN" w:eastAsia="en-IN" w:bidi="ml-IN"/>
-              </w:rPr>
-              <w:t xml:space="preserve"> CZy</w:t>
-            </w:r>
-            <w:r>
-              <w:rPr>
-                <w:rFonts w:ascii="BRH Malayalam Extra" w:eastAsia="Times New Roman" w:hAnsi="BRH Malayalam Extra" w:cs="BRH Malayalam Extra"/>
-                <w:color w:val="000000"/>
-                <w:sz w:val="32"/>
-                <w:szCs w:val="40"/>
-                <w:lang w:val="en-IN" w:eastAsia="en-IN" w:bidi="ml-IN"/>
-              </w:rPr>
-              <w:t>–</w:t>
-            </w:r>
-            <w:r>
-              <w:rPr>
-                <w:rFonts w:ascii="BRH Malayalam Extra" w:eastAsia="Times New Roman" w:hAnsi="BRH Malayalam Extra" w:cs="BRH Malayalam Extra"/>
-                <w:color w:val="000000"/>
-                <w:sz w:val="40"/>
-                <w:szCs w:val="40"/>
-                <w:lang w:val="en-IN" w:eastAsia="en-IN" w:bidi="ml-IN"/>
-              </w:rPr>
-              <w:t xml:space="preserve"> ¥Rx¥öræ˜ ||</w:t>
+                <w:lang w:val="en-IN" w:eastAsia="en-IN" w:bidi="ml-IN"/>
+              </w:rPr>
+              <w:t>Æ</w:t>
+            </w:r>
+            <w:r>
+              <w:rPr>
+                <w:rFonts w:ascii="BRH Malayalam Extra" w:eastAsia="Times New Roman" w:hAnsi="BRH Malayalam Extra" w:cs="BRH Malayalam Extra"/>
+                <w:color w:val="000000"/>
+                <w:sz w:val="40"/>
+                <w:szCs w:val="40"/>
+                <w:lang w:val="en-IN" w:eastAsia="en-IN" w:bidi="ml-IN"/>
+              </w:rPr>
+              <w:t xml:space="preserve">y </w:t>
+            </w:r>
+            <w:r>
+              <w:rPr>
+                <w:rFonts w:ascii="BRH Malayalam Extra" w:eastAsia="Times New Roman" w:hAnsi="BRH Malayalam Extra" w:cs="BRH Malayalam Extra"/>
+                <w:color w:val="000000"/>
+                <w:sz w:val="40"/>
+                <w:szCs w:val="40"/>
+                <w:lang w:val="en-IN" w:eastAsia="en-IN" w:bidi="ml-IN"/>
+              </w:rPr>
+              <w:t>–</w:t>
+            </w:r>
+            <w:r>
+              <w:rPr>
+                <w:rFonts w:ascii="BRH Malayalam Extra" w:eastAsia="Times New Roman" w:hAnsi="BRH Malayalam Extra" w:cs="BRH Malayalam Extra"/>
+                <w:color w:val="000000"/>
+                <w:sz w:val="40"/>
+                <w:szCs w:val="40"/>
+                <w:lang w:val="en-IN" w:eastAsia="en-IN" w:bidi="ml-IN"/>
+              </w:rPr>
+              <w:t xml:space="preserve"> </w:t>
+            </w:r>
+          </w:p>
+          <w:p>
+            <w:pPr>
+              <w:widowControl w:val="0"/>
+              <w:autoSpaceDE w:val="0"/>
+              <w:autoSpaceDN w:val="0"/>
+              <w:adjustRightInd w:val="0"/>
+              <w:spacing w:before="0" w:line="240" w:lineRule="auto"/>
+              <w:rPr>
+                <w:rFonts w:ascii="BRH Malayalam Extra" w:eastAsia="Times New Roman" w:hAnsi="BRH Malayalam Extra" w:cs="BRH Malayalam Extra"/>
+                <w:color w:val="000000"/>
+                <w:sz w:val="40"/>
+                <w:szCs w:val="40"/>
+                <w:lang w:eastAsia="en-IN" w:bidi="ml-IN"/>
+              </w:rPr>
+            </w:pPr>
+            <w:r>
+              <w:rPr>
+                <w:rFonts w:ascii="BRH Malayalam Extra" w:eastAsia="Times New Roman" w:hAnsi="BRH Malayalam Extra" w:cs="BRH Malayalam Extra"/>
+                <w:color w:val="000000"/>
+                <w:sz w:val="40"/>
+                <w:szCs w:val="40"/>
+                <w:lang w:val="en-IN" w:eastAsia="en-IN" w:bidi="ml-IN"/>
+              </w:rPr>
+              <w:t>AZy—rçZ§ |</w:t>
             </w:r>
           </w:p>
         </w:tc>
@@ -485,22 +599,128 @@
               <w:adjustRightInd w:val="0"/>
               <w:spacing w:before="0" w:line="240" w:lineRule="auto"/>
               <w:rPr>
-                <w:rFonts w:ascii="BRH Devanagari Extra" w:hAnsi="BRH Devanagari Extra" w:cs="BRH Devanagari Extra"/>
-                <w:color w:val="000000"/>
-                <w:sz w:val="40"/>
-                <w:szCs w:val="40"/>
-                <w:highlight w:val="yellow"/>
-              </w:rPr>
-            </w:pPr>
-            <w:r>
-              <w:rPr>
-                <w:rFonts w:ascii="BRH Malayalam Extra" w:eastAsia="Times New Roman" w:hAnsi="BRH Malayalam Extra" w:cs="BRH Malayalam Extra"/>
-                <w:color w:val="000000"/>
-                <w:sz w:val="40"/>
-                <w:szCs w:val="40"/>
-                <w:lang w:val="en-IN" w:eastAsia="en-IN" w:bidi="ml-IN"/>
-              </w:rPr>
-              <w:t>¥Rx</w:t>
+                <w:rFonts w:ascii="BRH Malayalam Extra" w:eastAsia="Times New Roman" w:hAnsi="BRH Malayalam Extra" w:cs="BRH Malayalam Extra"/>
+                <w:color w:val="000000"/>
+                <w:sz w:val="40"/>
+                <w:szCs w:val="40"/>
+                <w:lang w:val="en-IN" w:eastAsia="en-IN" w:bidi="ml-IN"/>
+              </w:rPr>
+            </w:pPr>
+            <w:r>
+              <w:rPr>
+                <w:rFonts w:ascii="BRH Malayalam Extra" w:eastAsia="Times New Roman" w:hAnsi="BRH Malayalam Extra" w:cs="BRH Malayalam Extra"/>
+                <w:color w:val="000000"/>
+                <w:sz w:val="40"/>
+                <w:szCs w:val="40"/>
+                <w:lang w:val="en-IN" w:eastAsia="en-IN" w:bidi="ml-IN"/>
+              </w:rPr>
+              <w:t>A</w:t>
+            </w:r>
+            <w:r>
+              <w:rPr>
+                <w:rFonts w:ascii="BRH Malayalam Extra" w:eastAsia="Times New Roman" w:hAnsi="BRH Malayalam Extra" w:cs="BRH Malayalam Extra"/>
+                <w:color w:val="000000"/>
+                <w:sz w:val="32"/>
+                <w:szCs w:val="40"/>
+                <w:lang w:val="en-IN" w:eastAsia="en-IN" w:bidi="ml-IN"/>
+              </w:rPr>
+              <w:t>–</w:t>
+            </w:r>
+            <w:r>
+              <w:rPr>
+                <w:rFonts w:ascii="BRH Malayalam Extra" w:eastAsia="Times New Roman" w:hAnsi="BRH Malayalam Extra" w:cs="BRH Malayalam Extra"/>
+                <w:color w:val="000000"/>
+                <w:sz w:val="40"/>
+                <w:szCs w:val="40"/>
+                <w:lang w:val="en-IN" w:eastAsia="en-IN" w:bidi="ml-IN"/>
+              </w:rPr>
+              <w:t>ÆõZy—rç</w:t>
+            </w:r>
+            <w:r>
+              <w:rPr>
+                <w:rFonts w:ascii="BRH Malayalam Extra" w:eastAsia="Times New Roman" w:hAnsi="BRH Malayalam Extra" w:cs="BRH Malayalam Extra"/>
+                <w:color w:val="000000"/>
+                <w:sz w:val="32"/>
+                <w:szCs w:val="40"/>
+                <w:lang w:val="en-IN" w:eastAsia="en-IN" w:bidi="ml-IN"/>
+              </w:rPr>
+              <w:t>–</w:t>
+            </w:r>
+            <w:r>
+              <w:rPr>
+                <w:rFonts w:ascii="BRH Malayalam Extra" w:eastAsia="Times New Roman" w:hAnsi="BRH Malayalam Extra" w:cs="BRH Malayalam Extra"/>
+                <w:color w:val="000000"/>
+                <w:sz w:val="40"/>
+                <w:szCs w:val="40"/>
+                <w:lang w:val="en-IN" w:eastAsia="en-IN" w:bidi="ml-IN"/>
+              </w:rPr>
+              <w:t xml:space="preserve">b§ h¡p—dxdy | </w:t>
+            </w:r>
+          </w:p>
+          <w:p>
+            <w:pPr>
+              <w:widowControl w:val="0"/>
+              <w:autoSpaceDE w:val="0"/>
+              <w:autoSpaceDN w:val="0"/>
+              <w:adjustRightInd w:val="0"/>
+              <w:spacing w:before="0" w:line="240" w:lineRule="auto"/>
+              <w:rPr>
+                <w:rFonts w:ascii="BRH Malayalam Extra" w:eastAsia="Times New Roman" w:hAnsi="BRH Malayalam Extra" w:cs="BRH Malayalam Extra"/>
+                <w:color w:val="000000"/>
+                <w:sz w:val="40"/>
+                <w:szCs w:val="40"/>
+                <w:lang w:val="en-IN" w:eastAsia="en-IN" w:bidi="ml-IN"/>
+              </w:rPr>
+            </w:pPr>
+            <w:r>
+              <w:rPr>
+                <w:rFonts w:ascii="BRH Malayalam Extra" w:eastAsia="Times New Roman" w:hAnsi="BRH Malayalam Extra" w:cs="BRH Malayalam Extra"/>
+                <w:color w:val="000000"/>
+                <w:sz w:val="40"/>
+                <w:szCs w:val="40"/>
+                <w:lang w:val="en-IN" w:eastAsia="en-IN" w:bidi="ml-IN"/>
+              </w:rPr>
+              <w:t>A</w:t>
+            </w:r>
+            <w:r>
+              <w:rPr>
+                <w:rFonts w:ascii="BRH Malayalam Extra" w:eastAsia="Times New Roman" w:hAnsi="BRH Malayalam Extra" w:cs="BRH Malayalam Extra"/>
+                <w:color w:val="000000"/>
+                <w:sz w:val="32"/>
+                <w:szCs w:val="40"/>
+                <w:lang w:val="en-IN" w:eastAsia="en-IN" w:bidi="ml-IN"/>
+              </w:rPr>
+              <w:t>–</w:t>
+            </w:r>
+            <w:r>
+              <w:rPr>
+                <w:rFonts w:ascii="BRH Malayalam Extra" w:eastAsia="Times New Roman" w:hAnsi="BRH Malayalam Extra" w:cs="BRH Malayalam Extra"/>
+                <w:color w:val="000000"/>
+                <w:sz w:val="40"/>
+                <w:szCs w:val="40"/>
+                <w:lang w:val="en-IN" w:eastAsia="en-IN" w:bidi="ml-IN"/>
+              </w:rPr>
+              <w:t>ÆõZy—rç</w:t>
+            </w:r>
+            <w:r>
+              <w:rPr>
+                <w:rFonts w:ascii="BRH Malayalam Extra" w:eastAsia="Times New Roman" w:hAnsi="BRH Malayalam Extra" w:cs="BRH Malayalam Extra"/>
+                <w:color w:val="000000"/>
+                <w:sz w:val="32"/>
+                <w:szCs w:val="40"/>
+                <w:lang w:val="en-IN" w:eastAsia="en-IN" w:bidi="ml-IN"/>
+              </w:rPr>
+              <w:t>–</w:t>
+            </w:r>
+            <w:r>
+              <w:rPr>
+                <w:rFonts w:ascii="BRH Malayalam Extra" w:eastAsia="Times New Roman" w:hAnsi="BRH Malayalam Extra" w:cs="BRH Malayalam Extra"/>
+                <w:color w:val="000000"/>
+                <w:sz w:val="40"/>
+                <w:szCs w:val="40"/>
+                <w:lang w:val="en-IN" w:eastAsia="en-IN" w:bidi="ml-IN"/>
+              </w:rPr>
+              <w:t>byZõ—</w:t>
             </w:r>
             <w:r>
               <w:rPr>
@@ -511,57 +731,63 @@
                 <w:highlight w:val="green"/>
                 <w:lang w:val="en-IN" w:eastAsia="en-IN" w:bidi="ml-IN"/>
               </w:rPr>
-              <w:t>öræ</w:t>
-            </w:r>
-            <w:r>
-              <w:rPr>
-                <w:rFonts w:ascii="BRH Malayalam Extra" w:eastAsia="Times New Roman" w:hAnsi="BRH Malayalam Extra" w:cs="BRH Malayalam Extra"/>
-                <w:color w:val="000000"/>
-                <w:sz w:val="32"/>
-                <w:szCs w:val="40"/>
-                <w:lang w:val="en-IN" w:eastAsia="en-IN" w:bidi="ml-IN"/>
-              </w:rPr>
-              <w:t>–</w:t>
-            </w:r>
-            <w:r>
-              <w:rPr>
-                <w:rFonts w:ascii="BRH Malayalam Extra" w:eastAsia="Times New Roman" w:hAnsi="BRH Malayalam Extra" w:cs="BRH Malayalam Extra"/>
-                <w:color w:val="000000"/>
-                <w:sz w:val="40"/>
-                <w:szCs w:val="40"/>
-                <w:lang w:val="en-IN" w:eastAsia="en-IN" w:bidi="ml-IN"/>
-              </w:rPr>
-              <w:t xml:space="preserve"> CZy</w:t>
-            </w:r>
-            <w:r>
-              <w:rPr>
-                <w:rFonts w:ascii="BRH Malayalam Extra" w:eastAsia="Times New Roman" w:hAnsi="BRH Malayalam Extra" w:cs="BRH Malayalam Extra"/>
-                <w:color w:val="000000"/>
-                <w:sz w:val="32"/>
-                <w:szCs w:val="40"/>
-                <w:lang w:val="en-IN" w:eastAsia="en-IN" w:bidi="ml-IN"/>
-              </w:rPr>
-              <w:t>–</w:t>
-            </w:r>
-            <w:r>
-              <w:rPr>
-                <w:rFonts w:ascii="BRH Malayalam Extra" w:eastAsia="Times New Roman" w:hAnsi="BRH Malayalam Extra" w:cs="BRH Malayalam Extra"/>
-                <w:color w:val="000000"/>
-                <w:sz w:val="40"/>
-                <w:szCs w:val="40"/>
-                <w:lang w:val="en-IN" w:eastAsia="en-IN" w:bidi="ml-IN"/>
-              </w:rPr>
-              <w:t xml:space="preserve"> ¥Rx¥öræ˜ || </w:t>
-            </w:r>
-            <w:r>
-              <w:rPr>
-                <w:rFonts w:ascii="BRH Malayalam Extra" w:eastAsia="Times New Roman" w:hAnsi="BRH Malayalam Extra" w:cs="BRH Malayalam Extra"/>
-                <w:color w:val="000000"/>
-                <w:sz w:val="40"/>
-                <w:szCs w:val="40"/>
-                <w:lang w:val="en-IN" w:eastAsia="en-IN" w:bidi="ml-IN"/>
-              </w:rPr>
-              <w:t>|</w:t>
+              <w:t>c</w:t>
+            </w:r>
+            <w:r>
+              <w:rPr>
+                <w:rFonts w:ascii="BRH Malayalam Extra" w:eastAsia="Times New Roman" w:hAnsi="BRH Malayalam Extra" w:cs="BRH Malayalam Extra"/>
+                <w:color w:val="000000"/>
+                <w:sz w:val="40"/>
+                <w:szCs w:val="40"/>
+                <w:lang w:val="en-IN" w:eastAsia="en-IN" w:bidi="ml-IN"/>
+              </w:rPr>
+              <w:t xml:space="preserve">y </w:t>
+            </w:r>
+            <w:r>
+              <w:rPr>
+                <w:rFonts w:ascii="BRH Malayalam Extra" w:eastAsia="Times New Roman" w:hAnsi="BRH Malayalam Extra" w:cs="BRH Malayalam Extra"/>
+                <w:color w:val="000000"/>
+                <w:sz w:val="40"/>
+                <w:szCs w:val="40"/>
+                <w:lang w:val="en-IN" w:eastAsia="en-IN" w:bidi="ml-IN"/>
+              </w:rPr>
+              <w:t>–</w:t>
+            </w:r>
+            <w:r>
+              <w:rPr>
+                <w:rFonts w:ascii="BRH Malayalam Extra" w:eastAsia="Times New Roman" w:hAnsi="BRH Malayalam Extra" w:cs="BRH Malayalam Extra"/>
+                <w:color w:val="000000"/>
+                <w:sz w:val="40"/>
+                <w:szCs w:val="40"/>
+                <w:lang w:val="en-IN" w:eastAsia="en-IN" w:bidi="ml-IN"/>
+              </w:rPr>
+              <w:t xml:space="preserve"> </w:t>
+            </w:r>
+          </w:p>
+          <w:p>
+            <w:pPr>
+              <w:widowControl w:val="0"/>
+              <w:autoSpaceDE w:val="0"/>
+              <w:autoSpaceDN w:val="0"/>
+              <w:adjustRightInd w:val="0"/>
+              <w:spacing w:before="0" w:line="240" w:lineRule="auto"/>
+              <w:rPr>
+                <w:rFonts w:ascii="BRH Malayalam Extra" w:eastAsia="Times New Roman" w:hAnsi="BRH Malayalam Extra" w:cs="BRH Malayalam Extra"/>
+                <w:color w:val="000000"/>
+                <w:sz w:val="40"/>
+                <w:szCs w:val="40"/>
+                <w:lang w:val="en-IN" w:eastAsia="en-IN" w:bidi="ml-IN"/>
+              </w:rPr>
+            </w:pPr>
+            <w:r>
+              <w:rPr>
+                <w:rFonts w:ascii="BRH Malayalam Extra" w:eastAsia="Times New Roman" w:hAnsi="BRH Malayalam Extra" w:cs="BRH Malayalam Extra"/>
+                <w:color w:val="000000"/>
+                <w:sz w:val="40"/>
+                <w:szCs w:val="40"/>
+                <w:lang w:val="en-IN" w:eastAsia="en-IN" w:bidi="ml-IN"/>
+              </w:rPr>
+              <w:t>AZy—rçZ§ |</w:t>
             </w:r>
           </w:p>
         </w:tc>
@@ -608,7 +834,7 @@
                 <w:sz w:val="28"/>
                 <w:szCs w:val="32"/>
               </w:rPr>
-              <w:t>9.4</w:t>
+              <w:t>3.2</w:t>
             </w:r>
             <w:r>
               <w:rPr>
@@ -636,6 +862,36 @@
                 <w:b/>
                 <w:sz w:val="28"/>
                 <w:szCs w:val="32"/>
+                <w:lang w:val="en-IN"/>
+              </w:rPr>
+            </w:pPr>
+            <w:r>
+              <w:rPr>
+                <w:rFonts w:cs="Arial"/>
+                <w:b/>
+                <w:sz w:val="28"/>
+                <w:szCs w:val="32"/>
+                <w:lang w:val="en-IN"/>
+              </w:rPr>
+              <w:t>Krama Vaakyam No.– 54</w:t>
+            </w:r>
+          </w:p>
+          <w:p>
+            <w:pPr>
+              <w:widowControl w:val="0"/>
+              <w:tabs>
+                <w:tab w:val="left" w:pos="993"/>
+              </w:tabs>
+              <w:autoSpaceDE w:val="0"/>
+              <w:autoSpaceDN w:val="0"/>
+              <w:adjustRightInd w:val="0"/>
+              <w:spacing w:before="0" w:line="252" w:lineRule="auto"/>
+              <w:ind w:right="297"/>
+              <w:rPr>
+                <w:rFonts w:cs="Arial"/>
+                <w:b/>
+                <w:sz w:val="28"/>
+                <w:szCs w:val="32"/>
                 <w:lang w:val="it-IT"/>
               </w:rPr>
             </w:pPr>
@@ -647,17 +903,307 @@
                 <w:szCs w:val="32"/>
                 <w:lang w:val="it-IT"/>
               </w:rPr>
-              <w:t xml:space="preserve">Krama Vaakyam No.– </w:t>
-            </w:r>
-            <w:r>
-              <w:rPr>
-                <w:rFonts w:cs="Arial"/>
-                <w:b/>
-                <w:sz w:val="28"/>
+              <w:t>Panchaati No</w:t>
+            </w:r>
+            <w:r>
+              <w:rPr>
+                <w:rFonts w:cs="Arial"/>
+                <w:b/>
                 <w:szCs w:val="32"/>
                 <w:lang w:val="it-IT"/>
               </w:rPr>
-              <w:t>23</w:t>
+              <w:t xml:space="preserve">. - </w:t>
+            </w:r>
+            <w:r>
+              <w:rPr>
+                <w:rFonts w:cs="Arial"/>
+                <w:b/>
+                <w:sz w:val="28"/>
+                <w:szCs w:val="32"/>
+                <w:lang w:val="it-IT"/>
+              </w:rPr>
+              <w:t>1</w:t>
+            </w:r>
+            <w:r>
+              <w:rPr>
+                <w:rFonts w:cs="Arial"/>
+                <w:b/>
+                <w:sz w:val="28"/>
+                <w:szCs w:val="32"/>
+                <w:lang w:val="it-IT"/>
+              </w:rPr>
+              <w:t>3</w:t>
+            </w:r>
+          </w:p>
+        </w:tc>
+        <w:tc>
+          <w:tcPr>
+            <w:tcW w:w="5103" w:type="dxa"/>
+          </w:tcPr>
+          <w:p>
+            <w:pPr>
+              <w:widowControl w:val="0"/>
+              <w:autoSpaceDE w:val="0"/>
+              <w:autoSpaceDN w:val="0"/>
+              <w:adjustRightInd w:val="0"/>
+              <w:spacing w:before="0" w:line="240" w:lineRule="auto"/>
+              <w:rPr>
+                <w:rFonts w:ascii="BRH Devanagari Extra" w:hAnsi="BRH Devanagari Extra" w:cs="BRH Devanagari Extra"/>
+                <w:color w:val="000000"/>
+                <w:sz w:val="40"/>
+                <w:szCs w:val="40"/>
+                <w:highlight w:val="yellow"/>
+                <w:lang w:val="it-IT"/>
+              </w:rPr>
+            </w:pPr>
+            <w:r>
+              <w:rPr>
+                <w:rFonts w:ascii="BRH Malayalam Extra" w:eastAsia="Times New Roman" w:hAnsi="BRH Malayalam Extra" w:cs="BRH Malayalam Extra"/>
+                <w:color w:val="000000"/>
+                <w:sz w:val="40"/>
+                <w:szCs w:val="40"/>
+                <w:lang w:val="it-IT" w:eastAsia="en-IN" w:bidi="ml-IN"/>
+              </w:rPr>
+              <w:t>¥Rx¥ö</w:t>
+            </w:r>
+            <w:r>
+              <w:rPr>
+                <w:rFonts w:ascii="BRH Malayalam Extra" w:eastAsia="Times New Roman" w:hAnsi="BRH Malayalam Extra" w:cs="BRH Malayalam Extra"/>
+                <w:color w:val="000000"/>
+                <w:sz w:val="40"/>
+                <w:szCs w:val="40"/>
+                <w:highlight w:val="yellow"/>
+                <w:lang w:val="it-IT" w:eastAsia="en-IN" w:bidi="ml-IN"/>
+              </w:rPr>
+              <w:t>r</w:t>
+            </w:r>
+            <w:r>
+              <w:rPr>
+                <w:rFonts w:ascii="BRH Malayalam Extra" w:eastAsia="Times New Roman" w:hAnsi="BRH Malayalam Extra" w:cs="BRH Malayalam Extra"/>
+                <w:color w:val="000000"/>
+                <w:sz w:val="40"/>
+                <w:szCs w:val="40"/>
+                <w:lang w:val="it-IT" w:eastAsia="en-IN" w:bidi="ml-IN"/>
+              </w:rPr>
+              <w:t>æ</w:t>
+            </w:r>
+            <w:r>
+              <w:rPr>
+                <w:rFonts w:ascii="BRH Malayalam Extra" w:eastAsia="Times New Roman" w:hAnsi="BRH Malayalam Extra" w:cs="BRH Malayalam Extra"/>
+                <w:color w:val="000000"/>
+                <w:sz w:val="32"/>
+                <w:szCs w:val="40"/>
+                <w:lang w:val="it-IT" w:eastAsia="en-IN" w:bidi="ml-IN"/>
+              </w:rPr>
+              <w:t>–</w:t>
+            </w:r>
+            <w:r>
+              <w:rPr>
+                <w:rFonts w:ascii="BRH Malayalam Extra" w:eastAsia="Times New Roman" w:hAnsi="BRH Malayalam Extra" w:cs="BRH Malayalam Extra"/>
+                <w:color w:val="000000"/>
+                <w:sz w:val="40"/>
+                <w:szCs w:val="40"/>
+                <w:lang w:val="it-IT" w:eastAsia="en-IN" w:bidi="ml-IN"/>
+              </w:rPr>
+              <w:t xml:space="preserve"> CZy</w:t>
+            </w:r>
+            <w:r>
+              <w:rPr>
+                <w:rFonts w:ascii="BRH Malayalam Extra" w:eastAsia="Times New Roman" w:hAnsi="BRH Malayalam Extra" w:cs="BRH Malayalam Extra"/>
+                <w:color w:val="000000"/>
+                <w:sz w:val="32"/>
+                <w:szCs w:val="40"/>
+                <w:lang w:val="it-IT" w:eastAsia="en-IN" w:bidi="ml-IN"/>
+              </w:rPr>
+              <w:t>–</w:t>
+            </w:r>
+            <w:r>
+              <w:rPr>
+                <w:rFonts w:ascii="BRH Malayalam Extra" w:eastAsia="Times New Roman" w:hAnsi="BRH Malayalam Extra" w:cs="BRH Malayalam Extra"/>
+                <w:color w:val="000000"/>
+                <w:sz w:val="40"/>
+                <w:szCs w:val="40"/>
+                <w:lang w:val="it-IT" w:eastAsia="en-IN" w:bidi="ml-IN"/>
+              </w:rPr>
+              <w:t xml:space="preserve"> ¥Rx¥öræ˜ ||</w:t>
+            </w:r>
+          </w:p>
+        </w:tc>
+        <w:tc>
+          <w:tcPr>
+            <w:tcW w:w="5386" w:type="dxa"/>
+          </w:tcPr>
+          <w:p>
+            <w:pPr>
+              <w:widowControl w:val="0"/>
+              <w:autoSpaceDE w:val="0"/>
+              <w:autoSpaceDN w:val="0"/>
+              <w:adjustRightInd w:val="0"/>
+              <w:spacing w:before="0" w:line="240" w:lineRule="auto"/>
+              <w:rPr>
+                <w:rFonts w:ascii="BRH Devanagari Extra" w:hAnsi="BRH Devanagari Extra" w:cs="BRH Devanagari Extra"/>
+                <w:color w:val="000000"/>
+                <w:sz w:val="40"/>
+                <w:szCs w:val="40"/>
+                <w:highlight w:val="yellow"/>
+              </w:rPr>
+            </w:pPr>
+            <w:r>
+              <w:rPr>
+                <w:rFonts w:ascii="BRH Malayalam Extra" w:eastAsia="Times New Roman" w:hAnsi="BRH Malayalam Extra" w:cs="BRH Malayalam Extra"/>
+                <w:color w:val="000000"/>
+                <w:sz w:val="40"/>
+                <w:szCs w:val="40"/>
+                <w:lang w:val="en-IN" w:eastAsia="en-IN" w:bidi="ml-IN"/>
+              </w:rPr>
+              <w:t>¥Rx</w:t>
+            </w:r>
+            <w:r>
+              <w:rPr>
+                <w:rFonts w:ascii="BRH Malayalam Extra" w:eastAsia="Times New Roman" w:hAnsi="BRH Malayalam Extra" w:cs="BRH Malayalam Extra"/>
+                <w:color w:val="000000"/>
+                <w:sz w:val="40"/>
+                <w:szCs w:val="40"/>
+                <w:highlight w:val="green"/>
+                <w:lang w:val="en-IN" w:eastAsia="en-IN" w:bidi="ml-IN"/>
+              </w:rPr>
+              <w:t>öræ</w:t>
+            </w:r>
+            <w:r>
+              <w:rPr>
+                <w:rFonts w:ascii="BRH Malayalam Extra" w:eastAsia="Times New Roman" w:hAnsi="BRH Malayalam Extra" w:cs="BRH Malayalam Extra"/>
+                <w:color w:val="000000"/>
+                <w:sz w:val="32"/>
+                <w:szCs w:val="40"/>
+                <w:lang w:val="en-IN" w:eastAsia="en-IN" w:bidi="ml-IN"/>
+              </w:rPr>
+              <w:t>–</w:t>
+            </w:r>
+            <w:r>
+              <w:rPr>
+                <w:rFonts w:ascii="BRH Malayalam Extra" w:eastAsia="Times New Roman" w:hAnsi="BRH Malayalam Extra" w:cs="BRH Malayalam Extra"/>
+                <w:color w:val="000000"/>
+                <w:sz w:val="40"/>
+                <w:szCs w:val="40"/>
+                <w:lang w:val="en-IN" w:eastAsia="en-IN" w:bidi="ml-IN"/>
+              </w:rPr>
+              <w:t xml:space="preserve"> CZy</w:t>
+            </w:r>
+            <w:r>
+              <w:rPr>
+                <w:rFonts w:ascii="BRH Malayalam Extra" w:eastAsia="Times New Roman" w:hAnsi="BRH Malayalam Extra" w:cs="BRH Malayalam Extra"/>
+                <w:color w:val="000000"/>
+                <w:sz w:val="32"/>
+                <w:szCs w:val="40"/>
+                <w:lang w:val="en-IN" w:eastAsia="en-IN" w:bidi="ml-IN"/>
+              </w:rPr>
+              <w:t>–</w:t>
+            </w:r>
+            <w:r>
+              <w:rPr>
+                <w:rFonts w:ascii="BRH Malayalam Extra" w:eastAsia="Times New Roman" w:hAnsi="BRH Malayalam Extra" w:cs="BRH Malayalam Extra"/>
+                <w:color w:val="000000"/>
+                <w:sz w:val="40"/>
+                <w:szCs w:val="40"/>
+                <w:lang w:val="en-IN" w:eastAsia="en-IN" w:bidi="ml-IN"/>
+              </w:rPr>
+              <w:t xml:space="preserve"> ¥Rx¥öræ˜ || </w:t>
+            </w:r>
+            <w:r>
+              <w:rPr>
+                <w:rFonts w:ascii="BRH Malayalam Extra" w:eastAsia="Times New Roman" w:hAnsi="BRH Malayalam Extra" w:cs="BRH Malayalam Extra"/>
+                <w:color w:val="000000"/>
+                <w:sz w:val="40"/>
+                <w:szCs w:val="40"/>
+                <w:lang w:val="en-IN" w:eastAsia="en-IN" w:bidi="ml-IN"/>
+              </w:rPr>
+              <w:t>|</w:t>
+            </w:r>
+          </w:p>
+        </w:tc>
+      </w:tr>
+      <w:tr>
+        <w:trPr>
+          <w:trHeight w:val="1118"/>
+        </w:trPr>
+        <w:tc>
+          <w:tcPr>
+            <w:tcW w:w="3906" w:type="dxa"/>
+          </w:tcPr>
+          <w:p>
+            <w:pPr>
+              <w:widowControl w:val="0"/>
+              <w:tabs>
+                <w:tab w:val="left" w:pos="993"/>
+              </w:tabs>
+              <w:autoSpaceDE w:val="0"/>
+              <w:autoSpaceDN w:val="0"/>
+              <w:adjustRightInd w:val="0"/>
+              <w:spacing w:before="0" w:line="252" w:lineRule="auto"/>
+              <w:ind w:right="297"/>
+              <w:rPr>
+                <w:rFonts w:cs="Arial"/>
+                <w:b/>
+                <w:sz w:val="28"/>
+                <w:szCs w:val="32"/>
+              </w:rPr>
+            </w:pPr>
+            <w:r>
+              <w:rPr>
+                <w:rFonts w:cs="Arial"/>
+                <w:b/>
+                <w:sz w:val="28"/>
+                <w:szCs w:val="32"/>
+              </w:rPr>
+              <w:t>T.S.4.6.</w:t>
+            </w:r>
+            <w:r>
+              <w:rPr>
+                <w:rFonts w:cs="Arial"/>
+                <w:b/>
+                <w:sz w:val="28"/>
+                <w:szCs w:val="32"/>
+              </w:rPr>
+              <w:t>9.4</w:t>
+            </w:r>
+            <w:r>
+              <w:rPr>
+                <w:rFonts w:cs="Arial"/>
+                <w:b/>
+                <w:sz w:val="28"/>
+                <w:szCs w:val="32"/>
+              </w:rPr>
+              <w:t xml:space="preserve"> – Kramam</w:t>
+            </w:r>
+          </w:p>
+          <w:p>
+            <w:pPr>
+              <w:widowControl w:val="0"/>
+              <w:tabs>
+                <w:tab w:val="left" w:pos="993"/>
+              </w:tabs>
+              <w:autoSpaceDE w:val="0"/>
+              <w:autoSpaceDN w:val="0"/>
+              <w:adjustRightInd w:val="0"/>
+              <w:spacing w:before="0" w:line="252" w:lineRule="auto"/>
+              <w:ind w:right="297"/>
+              <w:rPr>
+                <w:rFonts w:cs="Arial"/>
+                <w:b/>
+                <w:sz w:val="28"/>
+                <w:szCs w:val="32"/>
+                <w:lang w:val="en-IN"/>
+              </w:rPr>
+            </w:pPr>
+            <w:r>
+              <w:rPr>
+                <w:rFonts w:cs="Arial"/>
+                <w:b/>
+                <w:sz w:val="28"/>
+                <w:szCs w:val="32"/>
+                <w:lang w:val="en-IN"/>
+              </w:rPr>
+              <w:t>Krama Vaakyam No.– 23</w:t>
             </w:r>
           </w:p>
           <w:p>
@@ -1140,6 +1686,7 @@
                 <w:sz w:val="28"/>
                 <w:szCs w:val="32"/>
               </w:rPr>
+              <w:lastRenderedPageBreak/>
               <w:t>T.S.4.6.</w:t>
             </w:r>
             <w:r>
@@ -1744,7 +2291,6 @@
           <w:szCs w:val="32"/>
           <w:u w:val="single"/>
         </w:rPr>
-        <w:lastRenderedPageBreak/>
         <w:t>=========</w:t>
       </w:r>
     </w:p>
@@ -3151,6 +3697,7 @@
                 <w:sz w:val="28"/>
                 <w:szCs w:val="32"/>
               </w:rPr>
+              <w:lastRenderedPageBreak/>
               <w:t>T.S.4.6.6.4 – Kramam</w:t>
             </w:r>
           </w:p>
@@ -3913,7 +4460,6 @@
                 <w:sz w:val="28"/>
                 <w:szCs w:val="32"/>
               </w:rPr>
-              <w:lastRenderedPageBreak/>
               <w:t>T.S.4.6.7.5 – Kramam</w:t>
             </w:r>
           </w:p>
@@ -5468,6 +6014,7 @@
                 <w:sz w:val="28"/>
                 <w:szCs w:val="32"/>
               </w:rPr>
+              <w:lastRenderedPageBreak/>
               <w:t>T.S.4.6.9.1 – Kramam</w:t>
             </w:r>
           </w:p>
@@ -6156,7 +6703,6 @@
                 <w:sz w:val="28"/>
                 <w:szCs w:val="32"/>
               </w:rPr>
-              <w:lastRenderedPageBreak/>
               <w:t>T.S.4.6.9.2 – Kramam</w:t>
             </w:r>
           </w:p>
@@ -6487,7 +7033,16 @@
           <w:bCs/>
           <w:sz w:val="32"/>
         </w:rPr>
-        <w:t>replaced with</w:t>
+        <w:t xml:space="preserve">replaced </w:t>
+      </w:r>
+      <w:proofErr w:type="gramStart"/>
+      <w:r>
+        <w:rPr>
+          <w:b/>
+          <w:bCs/>
+          <w:sz w:val="32"/>
+        </w:rPr>
+        <w:t>with</w:t>
       </w:r>
       <w:r>
         <w:rPr>
@@ -6509,6 +7064,7 @@
         </w:rPr>
         <w:t>"</w:t>
       </w:r>
+      <w:proofErr w:type="gramEnd"/>
       <w:r>
         <w:rPr>
           <w:rFonts w:ascii="BRH Malayalam" w:hAnsi="BRH Malayalam" w:cs="BRH Malayalam"/>
@@ -6520,6 +7076,7 @@
         </w:rPr>
         <w:t>q§T</w:t>
       </w:r>
+      <w:proofErr w:type="gramStart"/>
       <w:r>
         <w:rPr>
           <w:rFonts w:ascii="BRH Malayalam" w:hAnsi="BRH Malayalam" w:cs="BRH Malayalam"/>
@@ -6536,7 +7093,16 @@
           <w:bCs/>
           <w:sz w:val="32"/>
         </w:rPr>
-        <w:t>wherever applicable</w:t>
+        <w:t>wherever</w:t>
+      </w:r>
+      <w:proofErr w:type="gramEnd"/>
+      <w:r>
+        <w:rPr>
+          <w:b/>
+          <w:bCs/>
+          <w:sz w:val="32"/>
+        </w:rPr>
+        <w:t xml:space="preserve"> applicable</w:t>
       </w:r>
     </w:p>
     <w:p>

</xml_diff>

<commit_message>
nmv 07 09 2026
</commit_message>
<xml_diff>
--- a/TS-Kramam/TS-4.6/TS 4.6 Malayalam Krama Paatam Corrections.docx
+++ b/TS-Kramam/TS-4.6/TS 4.6 Malayalam Krama Paatam Corrections.docx
@@ -81,18 +81,7 @@
           <w:szCs w:val="32"/>
           <w:u w:val="single"/>
         </w:rPr>
-        <w:t xml:space="preserve">Observed </w:t>
-      </w:r>
-      <w:proofErr w:type="gramStart"/>
-      <w:r>
-        <w:rPr>
-          <w:b/>
-          <w:bCs/>
-          <w:sz w:val="32"/>
-          <w:szCs w:val="32"/>
-          <w:u w:val="single"/>
-        </w:rPr>
-        <w:t xml:space="preserve">till </w:t>
+        <w:t xml:space="preserve">Observed till </w:t>
       </w:r>
       <w:r>
         <w:rPr>
@@ -105,7 +94,6 @@
         </w:rPr>
         <w:t>????</w:t>
       </w:r>
-      <w:proofErr w:type="gramEnd"/>
     </w:p>
     <w:p>
       <w:pPr>
@@ -399,9 +387,8 @@
                 <w:szCs w:val="40"/>
                 <w:lang w:eastAsia="en-IN" w:bidi="ml-IN"/>
               </w:rPr>
-              <w:t>pW§ g—</w:t>
-            </w:r>
-            <w:proofErr w:type="gramStart"/>
+              <w:t>pW§ g—ª</w:t>
+            </w:r>
             <w:r>
               <w:rPr>
                 <w:rFonts w:ascii="BRH Malayalam Extra" w:eastAsia="Times New Roman" w:hAnsi="BRH Malayalam Extra" w:cs="BRH Malayalam Extra"/>
@@ -410,7 +397,7 @@
                 <w:szCs w:val="40"/>
                 <w:lang w:eastAsia="en-IN" w:bidi="ml-IN"/>
               </w:rPr>
-              <w:t>ª</w:t>
+              <w:t>.</w:t>
             </w:r>
             <w:r>
               <w:rPr>
@@ -420,19 +407,8 @@
                 <w:szCs w:val="40"/>
                 <w:lang w:eastAsia="en-IN" w:bidi="ml-IN"/>
               </w:rPr>
-              <w:t>.</w:t>
-            </w:r>
-            <w:r>
-              <w:rPr>
-                <w:rFonts w:ascii="BRH Malayalam Extra" w:eastAsia="Times New Roman" w:hAnsi="BRH Malayalam Extra" w:cs="BRH Malayalam Extra"/>
-                <w:color w:val="000000"/>
-                <w:sz w:val="40"/>
-                <w:szCs w:val="40"/>
-                <w:lang w:eastAsia="en-IN" w:bidi="ml-IN"/>
-              </w:rPr>
               <w:t>ty</w:t>
             </w:r>
-            <w:proofErr w:type="gramEnd"/>
             <w:r>
               <w:rPr>
                 <w:rFonts w:ascii="BRH Malayalam Extra" w:eastAsia="Times New Roman" w:hAnsi="BRH Malayalam Extra" w:cs="BRH Malayalam Extra"/>
@@ -1663,16 +1639,7 @@
                 <w:sz w:val="28"/>
                 <w:szCs w:val="32"/>
               </w:rPr>
-              <w:t>4</w:t>
-            </w:r>
-            <w:r>
-              <w:rPr>
-                <w:rFonts w:cs="Arial"/>
-                <w:b/>
-                <w:sz w:val="28"/>
-                <w:szCs w:val="32"/>
-              </w:rPr>
-              <w:t>.2</w:t>
+              <w:t>4.2</w:t>
             </w:r>
             <w:r>
               <w:rPr>
@@ -1700,28 +1667,18 @@
                 <w:b/>
                 <w:sz w:val="28"/>
                 <w:szCs w:val="32"/>
-                <w:lang w:val="it-IT"/>
-              </w:rPr>
-            </w:pPr>
-            <w:r>
-              <w:rPr>
-                <w:rFonts w:cs="Arial"/>
-                <w:b/>
-                <w:sz w:val="28"/>
-                <w:szCs w:val="32"/>
-                <w:lang w:val="it-IT"/>
-              </w:rPr>
-              <w:t xml:space="preserve">Krama Vaakyam No.– </w:t>
-            </w:r>
-            <w:r>
-              <w:rPr>
-                <w:rFonts w:cs="Arial"/>
-                <w:b/>
-                <w:sz w:val="28"/>
-                <w:szCs w:val="32"/>
-                <w:lang w:val="it-IT"/>
-              </w:rPr>
-              <w:t>33</w:t>
+                <w:lang w:val="en-IN"/>
+              </w:rPr>
+            </w:pPr>
+            <w:r>
+              <w:rPr>
+                <w:rFonts w:cs="Arial"/>
+                <w:b/>
+                <w:sz w:val="28"/>
+                <w:szCs w:val="32"/>
+                <w:lang w:val="en-IN"/>
+              </w:rPr>
+              <w:t>Krama Vaakyam No.– 33</w:t>
             </w:r>
           </w:p>
           <w:p>
@@ -1790,16 +1747,16 @@
                 <w:color w:val="000000"/>
                 <w:sz w:val="40"/>
                 <w:szCs w:val="40"/>
-                <w:lang w:val="en-IN" w:eastAsia="en-IN" w:bidi="ml-IN"/>
-              </w:rPr>
-            </w:pPr>
-            <w:r>
-              <w:rPr>
-                <w:rFonts w:ascii="BRH Malayalam Extra" w:eastAsia="Times New Roman" w:hAnsi="BRH Malayalam Extra" w:cs="BRH Malayalam Extra"/>
-                <w:color w:val="000000"/>
-                <w:sz w:val="40"/>
-                <w:szCs w:val="40"/>
-                <w:lang w:val="en-IN" w:eastAsia="en-IN" w:bidi="ml-IN"/>
+                <w:lang w:val="it-IT" w:eastAsia="en-IN" w:bidi="ml-IN"/>
+              </w:rPr>
+            </w:pPr>
+            <w:r>
+              <w:rPr>
+                <w:rFonts w:ascii="BRH Malayalam Extra" w:eastAsia="Times New Roman" w:hAnsi="BRH Malayalam Extra" w:cs="BRH Malayalam Extra"/>
+                <w:color w:val="000000"/>
+                <w:sz w:val="40"/>
+                <w:szCs w:val="40"/>
+                <w:lang w:val="it-IT" w:eastAsia="en-IN" w:bidi="ml-IN"/>
               </w:rPr>
               <w:t>CöÉ</w:t>
             </w:r>
@@ -1809,7 +1766,7 @@
                 <w:color w:val="000000"/>
                 <w:sz w:val="36"/>
                 <w:szCs w:val="40"/>
-                <w:lang w:val="en-IN" w:eastAsia="en-IN" w:bidi="ml-IN"/>
+                <w:lang w:val="it-IT" w:eastAsia="en-IN" w:bidi="ml-IN"/>
               </w:rPr>
               <w:t>óè</w:t>
             </w:r>
@@ -1819,7 +1776,7 @@
                 <w:color w:val="000000"/>
                 <w:sz w:val="40"/>
                 <w:szCs w:val="40"/>
-                <w:lang w:val="en-IN" w:eastAsia="en-IN" w:bidi="ml-IN"/>
+                <w:lang w:val="it-IT" w:eastAsia="en-IN" w:bidi="ml-IN"/>
               </w:rPr>
               <w:t>— s</w:t>
             </w:r>
@@ -1830,7 +1787,7 @@
                 <w:sz w:val="40"/>
                 <w:szCs w:val="40"/>
                 <w:highlight w:val="yellow"/>
-                <w:lang w:val="en-IN" w:eastAsia="en-IN" w:bidi="ml-IN"/>
+                <w:lang w:val="it-IT" w:eastAsia="en-IN" w:bidi="ml-IN"/>
               </w:rPr>
               <w:t>Lx</w:t>
             </w:r>
@@ -1840,17 +1797,17 @@
                 <w:color w:val="000000"/>
                 <w:sz w:val="32"/>
                 <w:szCs w:val="40"/>
-                <w:lang w:val="en-IN" w:eastAsia="en-IN" w:bidi="ml-IN"/>
-              </w:rPr>
-              <w:t>–</w:t>
-            </w:r>
-            <w:r>
-              <w:rPr>
-                <w:rFonts w:ascii="BRH Malayalam Extra" w:eastAsia="Times New Roman" w:hAnsi="BRH Malayalam Extra" w:cs="BRH Malayalam Extra"/>
-                <w:color w:val="000000"/>
-                <w:sz w:val="40"/>
-                <w:szCs w:val="40"/>
-                <w:lang w:val="en-IN" w:eastAsia="en-IN" w:bidi="ml-IN"/>
+                <w:lang w:val="it-IT" w:eastAsia="en-IN" w:bidi="ml-IN"/>
+              </w:rPr>
+              <w:t>–</w:t>
+            </w:r>
+            <w:r>
+              <w:rPr>
+                <w:rFonts w:ascii="BRH Malayalam Extra" w:eastAsia="Times New Roman" w:hAnsi="BRH Malayalam Extra" w:cs="BRH Malayalam Extra"/>
+                <w:color w:val="000000"/>
+                <w:sz w:val="40"/>
+                <w:szCs w:val="40"/>
+                <w:lang w:val="it-IT" w:eastAsia="en-IN" w:bidi="ml-IN"/>
               </w:rPr>
               <w:t xml:space="preserve">jJ | </w:t>
             </w:r>
@@ -1867,16 +1824,16 @@
                 <w:color w:val="000000"/>
                 <w:sz w:val="40"/>
                 <w:szCs w:val="40"/>
-                <w:lang w:val="en-IN" w:eastAsia="en-IN" w:bidi="ml-IN"/>
-              </w:rPr>
-            </w:pPr>
-            <w:r>
-              <w:rPr>
-                <w:rFonts w:ascii="BRH Malayalam Extra" w:eastAsia="Times New Roman" w:hAnsi="BRH Malayalam Extra" w:cs="BRH Malayalam Extra"/>
-                <w:color w:val="000000"/>
-                <w:sz w:val="40"/>
-                <w:szCs w:val="40"/>
-                <w:lang w:val="en-IN" w:eastAsia="en-IN" w:bidi="ml-IN"/>
+                <w:lang w:val="it-IT" w:eastAsia="en-IN" w:bidi="ml-IN"/>
+              </w:rPr>
+            </w:pPr>
+            <w:r>
+              <w:rPr>
+                <w:rFonts w:ascii="BRH Malayalam Extra" w:eastAsia="Times New Roman" w:hAnsi="BRH Malayalam Extra" w:cs="BRH Malayalam Extra"/>
+                <w:color w:val="000000"/>
+                <w:sz w:val="40"/>
+                <w:szCs w:val="40"/>
+                <w:lang w:val="it-IT" w:eastAsia="en-IN" w:bidi="ml-IN"/>
               </w:rPr>
               <w:t>s</w:t>
             </w:r>
@@ -1886,17 +1843,17 @@
                 <w:color w:val="000000"/>
                 <w:sz w:val="32"/>
                 <w:szCs w:val="40"/>
-                <w:lang w:val="en-IN" w:eastAsia="en-IN" w:bidi="ml-IN"/>
-              </w:rPr>
-              <w:t>–</w:t>
-            </w:r>
-            <w:r>
-              <w:rPr>
-                <w:rFonts w:ascii="BRH Malayalam Extra" w:eastAsia="Times New Roman" w:hAnsi="BRH Malayalam Extra" w:cs="BRH Malayalam Extra"/>
-                <w:color w:val="000000"/>
-                <w:sz w:val="40"/>
-                <w:szCs w:val="40"/>
-                <w:lang w:val="en-IN" w:eastAsia="en-IN" w:bidi="ml-IN"/>
+                <w:lang w:val="it-IT" w:eastAsia="en-IN" w:bidi="ml-IN"/>
+              </w:rPr>
+              <w:t>–</w:t>
+            </w:r>
+            <w:r>
+              <w:rPr>
+                <w:rFonts w:ascii="BRH Malayalam Extra" w:eastAsia="Times New Roman" w:hAnsi="BRH Malayalam Extra" w:cs="BRH Malayalam Extra"/>
+                <w:color w:val="000000"/>
+                <w:sz w:val="40"/>
+                <w:szCs w:val="40"/>
+                <w:lang w:val="it-IT" w:eastAsia="en-IN" w:bidi="ml-IN"/>
               </w:rPr>
               <w:t>Lx</w:t>
             </w:r>
@@ -1906,17 +1863,17 @@
                 <w:color w:val="000000"/>
                 <w:sz w:val="32"/>
                 <w:szCs w:val="40"/>
-                <w:lang w:val="en-IN" w:eastAsia="en-IN" w:bidi="ml-IN"/>
-              </w:rPr>
-              <w:t>–</w:t>
-            </w:r>
-            <w:r>
-              <w:rPr>
-                <w:rFonts w:ascii="BRH Malayalam Extra" w:eastAsia="Times New Roman" w:hAnsi="BRH Malayalam Extra" w:cs="BRH Malayalam Extra"/>
-                <w:color w:val="000000"/>
-                <w:sz w:val="40"/>
-                <w:szCs w:val="40"/>
-                <w:lang w:val="en-IN" w:eastAsia="en-IN" w:bidi="ml-IN"/>
+                <w:lang w:val="it-IT" w:eastAsia="en-IN" w:bidi="ml-IN"/>
+              </w:rPr>
+              <w:t>–</w:t>
+            </w:r>
+            <w:r>
+              <w:rPr>
+                <w:rFonts w:ascii="BRH Malayalam Extra" w:eastAsia="Times New Roman" w:hAnsi="BRH Malayalam Extra" w:cs="BRH Malayalam Extra"/>
+                <w:color w:val="000000"/>
+                <w:sz w:val="40"/>
+                <w:szCs w:val="40"/>
+                <w:lang w:val="it-IT" w:eastAsia="en-IN" w:bidi="ml-IN"/>
               </w:rPr>
               <w:t>¥jx„d¡— |</w:t>
             </w:r>
@@ -1938,16 +1895,16 @@
                 <w:color w:val="000000"/>
                 <w:sz w:val="40"/>
                 <w:szCs w:val="40"/>
-                <w:lang w:val="en-IN" w:eastAsia="en-IN" w:bidi="ml-IN"/>
-              </w:rPr>
-            </w:pPr>
-            <w:r>
-              <w:rPr>
-                <w:rFonts w:ascii="BRH Malayalam Extra" w:eastAsia="Times New Roman" w:hAnsi="BRH Malayalam Extra" w:cs="BRH Malayalam Extra"/>
-                <w:color w:val="000000"/>
-                <w:sz w:val="40"/>
-                <w:szCs w:val="40"/>
-                <w:lang w:val="en-IN" w:eastAsia="en-IN" w:bidi="ml-IN"/>
+                <w:lang w:val="it-IT" w:eastAsia="en-IN" w:bidi="ml-IN"/>
+              </w:rPr>
+            </w:pPr>
+            <w:r>
+              <w:rPr>
+                <w:rFonts w:ascii="BRH Malayalam Extra" w:eastAsia="Times New Roman" w:hAnsi="BRH Malayalam Extra" w:cs="BRH Malayalam Extra"/>
+                <w:color w:val="000000"/>
+                <w:sz w:val="40"/>
+                <w:szCs w:val="40"/>
+                <w:lang w:val="it-IT" w:eastAsia="en-IN" w:bidi="ml-IN"/>
               </w:rPr>
               <w:t>CöÉ</w:t>
             </w:r>
@@ -1957,7 +1914,7 @@
                 <w:color w:val="000000"/>
                 <w:sz w:val="36"/>
                 <w:szCs w:val="40"/>
-                <w:lang w:val="en-IN" w:eastAsia="en-IN" w:bidi="ml-IN"/>
+                <w:lang w:val="it-IT" w:eastAsia="en-IN" w:bidi="ml-IN"/>
               </w:rPr>
               <w:t>óè</w:t>
             </w:r>
@@ -1967,7 +1924,7 @@
                 <w:color w:val="000000"/>
                 <w:sz w:val="40"/>
                 <w:szCs w:val="40"/>
-                <w:lang w:val="en-IN" w:eastAsia="en-IN" w:bidi="ml-IN"/>
+                <w:lang w:val="it-IT" w:eastAsia="en-IN" w:bidi="ml-IN"/>
               </w:rPr>
               <w:t>— s</w:t>
             </w:r>
@@ -1978,7 +1935,7 @@
                 <w:sz w:val="40"/>
                 <w:szCs w:val="40"/>
                 <w:highlight w:val="green"/>
-                <w:lang w:val="en-IN" w:eastAsia="en-IN" w:bidi="ml-IN"/>
+                <w:lang w:val="it-IT" w:eastAsia="en-IN" w:bidi="ml-IN"/>
               </w:rPr>
               <w:t>Lx</w:t>
             </w:r>
@@ -1988,7 +1945,7 @@
                 <w:color w:val="000000"/>
                 <w:sz w:val="40"/>
                 <w:szCs w:val="40"/>
-                <w:lang w:val="en-IN" w:eastAsia="en-IN" w:bidi="ml-IN"/>
+                <w:lang w:val="it-IT" w:eastAsia="en-IN" w:bidi="ml-IN"/>
               </w:rPr>
               <w:t xml:space="preserve">jJ | </w:t>
             </w:r>
@@ -2005,16 +1962,16 @@
                 <w:color w:val="000000"/>
                 <w:sz w:val="40"/>
                 <w:szCs w:val="40"/>
-                <w:lang w:eastAsia="en-IN" w:bidi="ml-IN"/>
-              </w:rPr>
-            </w:pPr>
-            <w:r>
-              <w:rPr>
-                <w:rFonts w:ascii="BRH Malayalam Extra" w:eastAsia="Times New Roman" w:hAnsi="BRH Malayalam Extra" w:cs="BRH Malayalam Extra"/>
-                <w:color w:val="000000"/>
-                <w:sz w:val="40"/>
-                <w:szCs w:val="40"/>
-                <w:lang w:val="en-IN" w:eastAsia="en-IN" w:bidi="ml-IN"/>
+                <w:lang w:val="it-IT" w:eastAsia="en-IN" w:bidi="ml-IN"/>
+              </w:rPr>
+            </w:pPr>
+            <w:r>
+              <w:rPr>
+                <w:rFonts w:ascii="BRH Malayalam Extra" w:eastAsia="Times New Roman" w:hAnsi="BRH Malayalam Extra" w:cs="BRH Malayalam Extra"/>
+                <w:color w:val="000000"/>
+                <w:sz w:val="40"/>
+                <w:szCs w:val="40"/>
+                <w:lang w:val="it-IT" w:eastAsia="en-IN" w:bidi="ml-IN"/>
               </w:rPr>
               <w:t>s</w:t>
             </w:r>
@@ -2024,17 +1981,17 @@
                 <w:color w:val="000000"/>
                 <w:sz w:val="32"/>
                 <w:szCs w:val="40"/>
-                <w:lang w:val="en-IN" w:eastAsia="en-IN" w:bidi="ml-IN"/>
-              </w:rPr>
-              <w:t>–</w:t>
-            </w:r>
-            <w:r>
-              <w:rPr>
-                <w:rFonts w:ascii="BRH Malayalam Extra" w:eastAsia="Times New Roman" w:hAnsi="BRH Malayalam Extra" w:cs="BRH Malayalam Extra"/>
-                <w:color w:val="000000"/>
-                <w:sz w:val="40"/>
-                <w:szCs w:val="40"/>
-                <w:lang w:val="en-IN" w:eastAsia="en-IN" w:bidi="ml-IN"/>
+                <w:lang w:val="it-IT" w:eastAsia="en-IN" w:bidi="ml-IN"/>
+              </w:rPr>
+              <w:t>–</w:t>
+            </w:r>
+            <w:r>
+              <w:rPr>
+                <w:rFonts w:ascii="BRH Malayalam Extra" w:eastAsia="Times New Roman" w:hAnsi="BRH Malayalam Extra" w:cs="BRH Malayalam Extra"/>
+                <w:color w:val="000000"/>
+                <w:sz w:val="40"/>
+                <w:szCs w:val="40"/>
+                <w:lang w:val="it-IT" w:eastAsia="en-IN" w:bidi="ml-IN"/>
               </w:rPr>
               <w:t>Lx</w:t>
             </w:r>
@@ -2044,17 +2001,17 @@
                 <w:color w:val="000000"/>
                 <w:sz w:val="32"/>
                 <w:szCs w:val="40"/>
-                <w:lang w:val="en-IN" w:eastAsia="en-IN" w:bidi="ml-IN"/>
-              </w:rPr>
-              <w:t>–</w:t>
-            </w:r>
-            <w:r>
-              <w:rPr>
-                <w:rFonts w:ascii="BRH Malayalam Extra" w:eastAsia="Times New Roman" w:hAnsi="BRH Malayalam Extra" w:cs="BRH Malayalam Extra"/>
-                <w:color w:val="000000"/>
-                <w:sz w:val="40"/>
-                <w:szCs w:val="40"/>
-                <w:lang w:val="en-IN" w:eastAsia="en-IN" w:bidi="ml-IN"/>
+                <w:lang w:val="it-IT" w:eastAsia="en-IN" w:bidi="ml-IN"/>
+              </w:rPr>
+              <w:t>–</w:t>
+            </w:r>
+            <w:r>
+              <w:rPr>
+                <w:rFonts w:ascii="BRH Malayalam Extra" w:eastAsia="Times New Roman" w:hAnsi="BRH Malayalam Extra" w:cs="BRH Malayalam Extra"/>
+                <w:color w:val="000000"/>
+                <w:sz w:val="40"/>
+                <w:szCs w:val="40"/>
+                <w:lang w:val="it-IT" w:eastAsia="en-IN" w:bidi="ml-IN"/>
               </w:rPr>
               <w:t>¥jx„d¡— |</w:t>
             </w:r>
@@ -2078,6 +2035,801 @@
               <w:autoSpaceDE w:val="0"/>
               <w:autoSpaceDN w:val="0"/>
               <w:adjustRightInd w:val="0"/>
+              <w:spacing w:before="0" w:line="240" w:lineRule="auto"/>
+              <w:ind w:right="297"/>
+              <w:rPr>
+                <w:rFonts w:cs="Arial"/>
+                <w:b/>
+                <w:sz w:val="28"/>
+                <w:szCs w:val="32"/>
+              </w:rPr>
+            </w:pPr>
+            <w:r>
+              <w:rPr>
+                <w:rFonts w:cs="Arial"/>
+                <w:b/>
+                <w:sz w:val="28"/>
+                <w:szCs w:val="32"/>
+              </w:rPr>
+              <w:t>T.S.4.6.</w:t>
+            </w:r>
+            <w:r>
+              <w:rPr>
+                <w:rFonts w:cs="Arial"/>
+                <w:b/>
+                <w:sz w:val="28"/>
+                <w:szCs w:val="32"/>
+              </w:rPr>
+              <w:t>6</w:t>
+            </w:r>
+            <w:r>
+              <w:rPr>
+                <w:rFonts w:cs="Arial"/>
+                <w:b/>
+                <w:sz w:val="28"/>
+                <w:szCs w:val="32"/>
+              </w:rPr>
+              <w:t>.</w:t>
+            </w:r>
+            <w:r>
+              <w:rPr>
+                <w:rFonts w:cs="Arial"/>
+                <w:b/>
+                <w:sz w:val="28"/>
+                <w:szCs w:val="32"/>
+              </w:rPr>
+              <w:t>2</w:t>
+            </w:r>
+            <w:r>
+              <w:rPr>
+                <w:rFonts w:cs="Arial"/>
+                <w:b/>
+                <w:sz w:val="28"/>
+                <w:szCs w:val="32"/>
+              </w:rPr>
+              <w:t xml:space="preserve"> – Kramam</w:t>
+            </w:r>
+          </w:p>
+          <w:p>
+            <w:pPr>
+              <w:widowControl w:val="0"/>
+              <w:tabs>
+                <w:tab w:val="left" w:pos="993"/>
+              </w:tabs>
+              <w:autoSpaceDE w:val="0"/>
+              <w:autoSpaceDN w:val="0"/>
+              <w:adjustRightInd w:val="0"/>
+              <w:spacing w:before="0" w:line="240" w:lineRule="auto"/>
+              <w:ind w:right="297"/>
+              <w:rPr>
+                <w:rFonts w:cs="Arial"/>
+                <w:b/>
+                <w:sz w:val="28"/>
+                <w:szCs w:val="32"/>
+                <w:lang w:val="it-IT"/>
+              </w:rPr>
+            </w:pPr>
+            <w:r>
+              <w:rPr>
+                <w:rFonts w:cs="Arial"/>
+                <w:b/>
+                <w:sz w:val="28"/>
+                <w:szCs w:val="32"/>
+                <w:lang w:val="it-IT"/>
+              </w:rPr>
+              <w:t xml:space="preserve">Krama Vaakyam No.– </w:t>
+            </w:r>
+            <w:r>
+              <w:rPr>
+                <w:rFonts w:cs="Arial"/>
+                <w:b/>
+                <w:sz w:val="28"/>
+                <w:szCs w:val="32"/>
+                <w:lang w:val="it-IT"/>
+              </w:rPr>
+              <w:t>58</w:t>
+            </w:r>
+          </w:p>
+          <w:p>
+            <w:pPr>
+              <w:widowControl w:val="0"/>
+              <w:tabs>
+                <w:tab w:val="left" w:pos="993"/>
+              </w:tabs>
+              <w:autoSpaceDE w:val="0"/>
+              <w:autoSpaceDN w:val="0"/>
+              <w:adjustRightInd w:val="0"/>
+              <w:spacing w:before="0" w:line="252" w:lineRule="auto"/>
+              <w:ind w:right="297"/>
+              <w:rPr>
+                <w:rFonts w:cs="Arial"/>
+                <w:b/>
+                <w:sz w:val="28"/>
+                <w:szCs w:val="32"/>
+                <w:lang w:val="it-IT"/>
+              </w:rPr>
+            </w:pPr>
+            <w:r>
+              <w:rPr>
+                <w:rFonts w:cs="Arial"/>
+                <w:b/>
+                <w:sz w:val="28"/>
+                <w:szCs w:val="32"/>
+                <w:lang w:val="it-IT"/>
+              </w:rPr>
+              <w:t>Panchaati No</w:t>
+            </w:r>
+            <w:r>
+              <w:rPr>
+                <w:rFonts w:cs="Arial"/>
+                <w:b/>
+                <w:szCs w:val="32"/>
+                <w:lang w:val="it-IT"/>
+              </w:rPr>
+              <w:t xml:space="preserve">. - </w:t>
+            </w:r>
+            <w:r>
+              <w:rPr>
+                <w:rFonts w:cs="Arial"/>
+                <w:b/>
+                <w:sz w:val="28"/>
+                <w:szCs w:val="32"/>
+                <w:lang w:val="it-IT"/>
+              </w:rPr>
+              <w:t>28</w:t>
+            </w:r>
+          </w:p>
+        </w:tc>
+        <w:tc>
+          <w:tcPr>
+            <w:tcW w:w="5103" w:type="dxa"/>
+          </w:tcPr>
+          <w:p>
+            <w:pPr>
+              <w:widowControl w:val="0"/>
+              <w:autoSpaceDE w:val="0"/>
+              <w:autoSpaceDN w:val="0"/>
+              <w:adjustRightInd w:val="0"/>
+              <w:spacing w:before="0" w:line="240" w:lineRule="auto"/>
+              <w:rPr>
+                <w:rFonts w:ascii="BRH Malayalam Extra" w:eastAsia="Times New Roman" w:hAnsi="BRH Malayalam Extra" w:cs="BRH Malayalam Extra"/>
+                <w:color w:val="000000"/>
+                <w:sz w:val="40"/>
+                <w:szCs w:val="40"/>
+                <w:lang w:val="it-IT" w:eastAsia="en-IN" w:bidi="ml-IN"/>
+              </w:rPr>
+            </w:pPr>
+            <w:r>
+              <w:rPr>
+                <w:rFonts w:ascii="BRH Malayalam Extra" w:eastAsia="Times New Roman" w:hAnsi="BRH Malayalam Extra" w:cs="BRH Malayalam Extra"/>
+                <w:color w:val="000000"/>
+                <w:sz w:val="40"/>
+                <w:szCs w:val="40"/>
+                <w:lang w:val="it-IT" w:eastAsia="en-IN" w:bidi="ml-IN"/>
+              </w:rPr>
+              <w:t>A</w:t>
+            </w:r>
+            <w:r>
+              <w:rPr>
+                <w:rFonts w:ascii="BRH Malayalam Extra" w:eastAsia="Times New Roman" w:hAnsi="BRH Malayalam Extra" w:cs="BRH Malayalam Extra"/>
+                <w:color w:val="000000"/>
+                <w:sz w:val="32"/>
+                <w:szCs w:val="40"/>
+                <w:lang w:val="it-IT" w:eastAsia="en-IN" w:bidi="ml-IN"/>
+              </w:rPr>
+              <w:t>–</w:t>
+            </w:r>
+            <w:r>
+              <w:rPr>
+                <w:rFonts w:ascii="BRH Malayalam Extra" w:eastAsia="Times New Roman" w:hAnsi="BRH Malayalam Extra" w:cs="BRH Malayalam Extra"/>
+                <w:color w:val="000000"/>
+                <w:sz w:val="40"/>
+                <w:szCs w:val="40"/>
+                <w:lang w:val="it-IT" w:eastAsia="en-IN" w:bidi="ml-IN"/>
+              </w:rPr>
+              <w:t>hzq¢</w:t>
+            </w:r>
+            <w:r>
+              <w:rPr>
+                <w:rFonts w:ascii="BRH Malayalam Extra" w:eastAsia="Times New Roman" w:hAnsi="BRH Malayalam Extra" w:cs="BRH Malayalam Extra"/>
+                <w:color w:val="000000"/>
+                <w:sz w:val="40"/>
+                <w:szCs w:val="40"/>
+                <w:highlight w:val="yellow"/>
+                <w:lang w:val="it-IT" w:eastAsia="en-IN" w:bidi="ml-IN"/>
+              </w:rPr>
+              <w:t>dx—I</w:t>
+            </w:r>
+            <w:r>
+              <w:rPr>
+                <w:rFonts w:ascii="BRH Malayalam Extra" w:eastAsia="Times New Roman" w:hAnsi="BRH Malayalam Extra" w:cs="BRH Malayalam Extra"/>
+                <w:color w:val="000000"/>
+                <w:sz w:val="40"/>
+                <w:szCs w:val="40"/>
+                <w:lang w:val="it-IT" w:eastAsia="en-IN" w:bidi="ml-IN"/>
+              </w:rPr>
+              <w:t xml:space="preserve"> ity</w:t>
+            </w:r>
+            <w:r>
+              <w:rPr>
+                <w:rFonts w:ascii="BRH Malayalam Extra" w:eastAsia="Times New Roman" w:hAnsi="BRH Malayalam Extra" w:cs="BRH Malayalam Extra"/>
+                <w:color w:val="000000"/>
+                <w:sz w:val="32"/>
+                <w:szCs w:val="40"/>
+                <w:lang w:val="it-IT" w:eastAsia="en-IN" w:bidi="ml-IN"/>
+              </w:rPr>
+              <w:t>–</w:t>
+            </w:r>
+            <w:r>
+              <w:rPr>
+                <w:rFonts w:ascii="BRH Malayalam Extra" w:eastAsia="Times New Roman" w:hAnsi="BRH Malayalam Extra" w:cs="BRH Malayalam Extra"/>
+                <w:color w:val="000000"/>
+                <w:sz w:val="40"/>
+                <w:szCs w:val="40"/>
+                <w:lang w:val="it-IT" w:eastAsia="en-IN" w:bidi="ml-IN"/>
+              </w:rPr>
+              <w:t xml:space="preserve">ixd˜I | </w:t>
+            </w:r>
+          </w:p>
+          <w:p>
+            <w:pPr>
+              <w:widowControl w:val="0"/>
+              <w:autoSpaceDE w:val="0"/>
+              <w:autoSpaceDN w:val="0"/>
+              <w:adjustRightInd w:val="0"/>
+              <w:spacing w:before="0" w:line="240" w:lineRule="auto"/>
+              <w:rPr>
+                <w:rFonts w:ascii="BRH Malayalam Extra" w:eastAsia="Times New Roman" w:hAnsi="BRH Malayalam Extra" w:cs="BRH Malayalam Extra"/>
+                <w:color w:val="000000"/>
+                <w:sz w:val="40"/>
+                <w:szCs w:val="40"/>
+                <w:lang w:val="it-IT" w:eastAsia="en-IN" w:bidi="ml-IN"/>
+              </w:rPr>
+            </w:pPr>
+            <w:r>
+              <w:rPr>
+                <w:rFonts w:ascii="BRH Malayalam Extra" w:eastAsia="Times New Roman" w:hAnsi="BRH Malayalam Extra" w:cs="BRH Malayalam Extra"/>
+                <w:color w:val="000000"/>
+                <w:sz w:val="40"/>
+                <w:szCs w:val="40"/>
+                <w:lang w:val="it-IT" w:eastAsia="en-IN" w:bidi="ml-IN"/>
+              </w:rPr>
+              <w:t>i</w:t>
+            </w:r>
+            <w:r>
+              <w:rPr>
+                <w:rFonts w:ascii="BRH Malayalam Extra" w:eastAsia="Times New Roman" w:hAnsi="BRH Malayalam Extra" w:cs="BRH Malayalam Extra"/>
+                <w:color w:val="000000"/>
+                <w:sz w:val="32"/>
+                <w:szCs w:val="40"/>
+                <w:lang w:val="it-IT" w:eastAsia="en-IN" w:bidi="ml-IN"/>
+              </w:rPr>
+              <w:t>–</w:t>
+            </w:r>
+            <w:r>
+              <w:rPr>
+                <w:rFonts w:ascii="BRH Malayalam Extra" w:eastAsia="Times New Roman" w:hAnsi="BRH Malayalam Extra" w:cs="BRH Malayalam Extra"/>
+                <w:color w:val="000000"/>
+                <w:sz w:val="40"/>
+                <w:szCs w:val="40"/>
+                <w:lang w:val="it-IT" w:eastAsia="en-IN" w:bidi="ml-IN"/>
+              </w:rPr>
+              <w:t>ty</w:t>
+            </w:r>
+            <w:r>
+              <w:rPr>
+                <w:rFonts w:ascii="BRH Malayalam Extra" w:eastAsia="Times New Roman" w:hAnsi="BRH Malayalam Extra" w:cs="BRH Malayalam Extra"/>
+                <w:color w:val="000000"/>
+                <w:sz w:val="32"/>
+                <w:szCs w:val="40"/>
+                <w:lang w:val="it-IT" w:eastAsia="en-IN" w:bidi="ml-IN"/>
+              </w:rPr>
+              <w:t>–</w:t>
+            </w:r>
+            <w:r>
+              <w:rPr>
+                <w:rFonts w:ascii="BRH Malayalam Extra" w:eastAsia="Times New Roman" w:hAnsi="BRH Malayalam Extra" w:cs="BRH Malayalam Extra"/>
+                <w:color w:val="000000"/>
+                <w:sz w:val="40"/>
+                <w:szCs w:val="40"/>
+                <w:lang w:val="it-IT" w:eastAsia="en-IN" w:bidi="ml-IN"/>
+              </w:rPr>
+              <w:t>ixd—I edxjZ |</w:t>
+            </w:r>
+          </w:p>
+        </w:tc>
+        <w:tc>
+          <w:tcPr>
+            <w:tcW w:w="5386" w:type="dxa"/>
+          </w:tcPr>
+          <w:p>
+            <w:pPr>
+              <w:widowControl w:val="0"/>
+              <w:autoSpaceDE w:val="0"/>
+              <w:autoSpaceDN w:val="0"/>
+              <w:adjustRightInd w:val="0"/>
+              <w:spacing w:before="0" w:line="240" w:lineRule="auto"/>
+              <w:rPr>
+                <w:rFonts w:ascii="BRH Malayalam Extra" w:eastAsia="Times New Roman" w:hAnsi="BRH Malayalam Extra" w:cs="BRH Malayalam Extra"/>
+                <w:color w:val="000000"/>
+                <w:sz w:val="40"/>
+                <w:szCs w:val="40"/>
+                <w:lang w:val="it-IT" w:eastAsia="en-IN" w:bidi="ml-IN"/>
+              </w:rPr>
+            </w:pPr>
+            <w:r>
+              <w:rPr>
+                <w:rFonts w:ascii="BRH Malayalam Extra" w:eastAsia="Times New Roman" w:hAnsi="BRH Malayalam Extra" w:cs="BRH Malayalam Extra"/>
+                <w:color w:val="000000"/>
+                <w:sz w:val="40"/>
+                <w:szCs w:val="40"/>
+                <w:lang w:val="it-IT" w:eastAsia="en-IN" w:bidi="ml-IN"/>
+              </w:rPr>
+              <w:t>A</w:t>
+            </w:r>
+            <w:r>
+              <w:rPr>
+                <w:rFonts w:ascii="BRH Malayalam Extra" w:eastAsia="Times New Roman" w:hAnsi="BRH Malayalam Extra" w:cs="BRH Malayalam Extra"/>
+                <w:color w:val="000000"/>
+                <w:sz w:val="32"/>
+                <w:szCs w:val="40"/>
+                <w:lang w:val="it-IT" w:eastAsia="en-IN" w:bidi="ml-IN"/>
+              </w:rPr>
+              <w:t>–</w:t>
+            </w:r>
+            <w:r>
+              <w:rPr>
+                <w:rFonts w:ascii="BRH Malayalam Extra" w:eastAsia="Times New Roman" w:hAnsi="BRH Malayalam Extra" w:cs="BRH Malayalam Extra"/>
+                <w:color w:val="000000"/>
+                <w:sz w:val="40"/>
+                <w:szCs w:val="40"/>
+                <w:lang w:val="it-IT" w:eastAsia="en-IN" w:bidi="ml-IN"/>
+              </w:rPr>
+              <w:t>hz</w:t>
+            </w:r>
+            <w:r>
+              <w:rPr>
+                <w:rFonts w:ascii="BRH Malayalam Extra" w:eastAsia="Times New Roman" w:hAnsi="BRH Malayalam Extra" w:cs="BRH Malayalam Extra"/>
+                <w:color w:val="000000"/>
+                <w:sz w:val="40"/>
+                <w:szCs w:val="40"/>
+                <w:highlight w:val="green"/>
+                <w:lang w:val="it-IT" w:eastAsia="en-IN" w:bidi="ml-IN"/>
+              </w:rPr>
+              <w:t>q¢</w:t>
+            </w:r>
+            <w:r>
+              <w:rPr>
+                <w:rFonts w:ascii="BRH Malayalam Extra" w:eastAsia="Times New Roman" w:hAnsi="BRH Malayalam Extra" w:cs="BRH Malayalam Extra"/>
+                <w:color w:val="000000"/>
+                <w:sz w:val="40"/>
+                <w:szCs w:val="40"/>
+                <w:lang w:val="it-IT" w:eastAsia="en-IN" w:bidi="ml-IN"/>
+              </w:rPr>
+              <w:t>—dxI ity</w:t>
+            </w:r>
+            <w:r>
+              <w:rPr>
+                <w:rFonts w:ascii="BRH Malayalam Extra" w:eastAsia="Times New Roman" w:hAnsi="BRH Malayalam Extra" w:cs="BRH Malayalam Extra"/>
+                <w:color w:val="000000"/>
+                <w:sz w:val="32"/>
+                <w:szCs w:val="40"/>
+                <w:lang w:val="it-IT" w:eastAsia="en-IN" w:bidi="ml-IN"/>
+              </w:rPr>
+              <w:t>–</w:t>
+            </w:r>
+            <w:r>
+              <w:rPr>
+                <w:rFonts w:ascii="BRH Malayalam Extra" w:eastAsia="Times New Roman" w:hAnsi="BRH Malayalam Extra" w:cs="BRH Malayalam Extra"/>
+                <w:color w:val="000000"/>
+                <w:sz w:val="40"/>
+                <w:szCs w:val="40"/>
+                <w:lang w:val="it-IT" w:eastAsia="en-IN" w:bidi="ml-IN"/>
+              </w:rPr>
+              <w:t xml:space="preserve">ixd˜I | </w:t>
+            </w:r>
+          </w:p>
+          <w:p>
+            <w:pPr>
+              <w:widowControl w:val="0"/>
+              <w:autoSpaceDE w:val="0"/>
+              <w:autoSpaceDN w:val="0"/>
+              <w:adjustRightInd w:val="0"/>
+              <w:spacing w:before="0" w:line="240" w:lineRule="auto"/>
+              <w:rPr>
+                <w:rFonts w:ascii="BRH Malayalam Extra" w:eastAsia="Times New Roman" w:hAnsi="BRH Malayalam Extra" w:cs="BRH Malayalam Extra"/>
+                <w:color w:val="000000"/>
+                <w:sz w:val="40"/>
+                <w:szCs w:val="40"/>
+                <w:lang w:val="it-IT" w:eastAsia="en-IN" w:bidi="ml-IN"/>
+              </w:rPr>
+            </w:pPr>
+            <w:r>
+              <w:rPr>
+                <w:rFonts w:ascii="BRH Malayalam Extra" w:eastAsia="Times New Roman" w:hAnsi="BRH Malayalam Extra" w:cs="BRH Malayalam Extra"/>
+                <w:color w:val="000000"/>
+                <w:sz w:val="40"/>
+                <w:szCs w:val="40"/>
+                <w:lang w:val="it-IT" w:eastAsia="en-IN" w:bidi="ml-IN"/>
+              </w:rPr>
+              <w:t>i</w:t>
+            </w:r>
+            <w:r>
+              <w:rPr>
+                <w:rFonts w:ascii="BRH Malayalam Extra" w:eastAsia="Times New Roman" w:hAnsi="BRH Malayalam Extra" w:cs="BRH Malayalam Extra"/>
+                <w:color w:val="000000"/>
+                <w:sz w:val="32"/>
+                <w:szCs w:val="40"/>
+                <w:lang w:val="it-IT" w:eastAsia="en-IN" w:bidi="ml-IN"/>
+              </w:rPr>
+              <w:t>–</w:t>
+            </w:r>
+            <w:r>
+              <w:rPr>
+                <w:rFonts w:ascii="BRH Malayalam Extra" w:eastAsia="Times New Roman" w:hAnsi="BRH Malayalam Extra" w:cs="BRH Malayalam Extra"/>
+                <w:color w:val="000000"/>
+                <w:sz w:val="40"/>
+                <w:szCs w:val="40"/>
+                <w:lang w:val="it-IT" w:eastAsia="en-IN" w:bidi="ml-IN"/>
+              </w:rPr>
+              <w:t>ty</w:t>
+            </w:r>
+            <w:r>
+              <w:rPr>
+                <w:rFonts w:ascii="BRH Malayalam Extra" w:eastAsia="Times New Roman" w:hAnsi="BRH Malayalam Extra" w:cs="BRH Malayalam Extra"/>
+                <w:color w:val="000000"/>
+                <w:sz w:val="32"/>
+                <w:szCs w:val="40"/>
+                <w:lang w:val="it-IT" w:eastAsia="en-IN" w:bidi="ml-IN"/>
+              </w:rPr>
+              <w:t>–</w:t>
+            </w:r>
+            <w:r>
+              <w:rPr>
+                <w:rFonts w:ascii="BRH Malayalam Extra" w:eastAsia="Times New Roman" w:hAnsi="BRH Malayalam Extra" w:cs="BRH Malayalam Extra"/>
+                <w:color w:val="000000"/>
+                <w:sz w:val="40"/>
+                <w:szCs w:val="40"/>
+                <w:lang w:val="it-IT" w:eastAsia="en-IN" w:bidi="ml-IN"/>
+              </w:rPr>
+              <w:t>ixd—I edxjZ |</w:t>
+            </w:r>
+          </w:p>
+        </w:tc>
+      </w:tr>
+      <w:tr>
+        <w:trPr>
+          <w:trHeight w:val="983"/>
+        </w:trPr>
+        <w:tc>
+          <w:tcPr>
+            <w:tcW w:w="3906" w:type="dxa"/>
+          </w:tcPr>
+          <w:p>
+            <w:pPr>
+              <w:widowControl w:val="0"/>
+              <w:tabs>
+                <w:tab w:val="left" w:pos="993"/>
+              </w:tabs>
+              <w:autoSpaceDE w:val="0"/>
+              <w:autoSpaceDN w:val="0"/>
+              <w:adjustRightInd w:val="0"/>
+              <w:spacing w:before="0" w:line="240" w:lineRule="auto"/>
+              <w:ind w:right="297"/>
+              <w:rPr>
+                <w:rFonts w:cs="Arial"/>
+                <w:b/>
+                <w:sz w:val="28"/>
+                <w:szCs w:val="32"/>
+              </w:rPr>
+            </w:pPr>
+            <w:r>
+              <w:rPr>
+                <w:rFonts w:cs="Arial"/>
+                <w:b/>
+                <w:sz w:val="28"/>
+                <w:szCs w:val="32"/>
+              </w:rPr>
+              <w:lastRenderedPageBreak/>
+              <w:t>T.S.4.6.</w:t>
+            </w:r>
+            <w:r>
+              <w:rPr>
+                <w:rFonts w:cs="Arial"/>
+                <w:b/>
+                <w:sz w:val="28"/>
+                <w:szCs w:val="32"/>
+              </w:rPr>
+              <w:t>6.3</w:t>
+            </w:r>
+            <w:r>
+              <w:rPr>
+                <w:rFonts w:cs="Arial"/>
+                <w:b/>
+                <w:sz w:val="28"/>
+                <w:szCs w:val="32"/>
+              </w:rPr>
+              <w:t xml:space="preserve"> – Kramam</w:t>
+            </w:r>
+          </w:p>
+          <w:p>
+            <w:pPr>
+              <w:widowControl w:val="0"/>
+              <w:tabs>
+                <w:tab w:val="left" w:pos="993"/>
+              </w:tabs>
+              <w:autoSpaceDE w:val="0"/>
+              <w:autoSpaceDN w:val="0"/>
+              <w:adjustRightInd w:val="0"/>
+              <w:spacing w:before="0" w:line="240" w:lineRule="auto"/>
+              <w:ind w:right="297"/>
+              <w:rPr>
+                <w:rFonts w:cs="Arial"/>
+                <w:b/>
+                <w:sz w:val="28"/>
+                <w:szCs w:val="32"/>
+                <w:lang w:val="it-IT"/>
+              </w:rPr>
+            </w:pPr>
+            <w:r>
+              <w:rPr>
+                <w:rFonts w:cs="Arial"/>
+                <w:b/>
+                <w:sz w:val="28"/>
+                <w:szCs w:val="32"/>
+                <w:lang w:val="it-IT"/>
+              </w:rPr>
+              <w:t xml:space="preserve">Krama Vaakyam No.– </w:t>
+            </w:r>
+            <w:r>
+              <w:rPr>
+                <w:rFonts w:cs="Arial"/>
+                <w:b/>
+                <w:sz w:val="28"/>
+                <w:szCs w:val="32"/>
+                <w:lang w:val="it-IT"/>
+              </w:rPr>
+              <w:t>63</w:t>
+            </w:r>
+          </w:p>
+          <w:p>
+            <w:pPr>
+              <w:widowControl w:val="0"/>
+              <w:tabs>
+                <w:tab w:val="left" w:pos="993"/>
+              </w:tabs>
+              <w:autoSpaceDE w:val="0"/>
+              <w:autoSpaceDN w:val="0"/>
+              <w:adjustRightInd w:val="0"/>
+              <w:spacing w:before="0" w:line="252" w:lineRule="auto"/>
+              <w:ind w:right="297"/>
+              <w:rPr>
+                <w:rFonts w:cs="Arial"/>
+                <w:b/>
+                <w:sz w:val="28"/>
+                <w:szCs w:val="32"/>
+                <w:lang w:val="it-IT"/>
+              </w:rPr>
+            </w:pPr>
+            <w:r>
+              <w:rPr>
+                <w:rFonts w:cs="Arial"/>
+                <w:b/>
+                <w:sz w:val="28"/>
+                <w:szCs w:val="32"/>
+                <w:lang w:val="it-IT"/>
+              </w:rPr>
+              <w:t>Panchaati No</w:t>
+            </w:r>
+            <w:r>
+              <w:rPr>
+                <w:rFonts w:cs="Arial"/>
+                <w:b/>
+                <w:szCs w:val="32"/>
+                <w:lang w:val="it-IT"/>
+              </w:rPr>
+              <w:t xml:space="preserve">. - </w:t>
+            </w:r>
+            <w:r>
+              <w:rPr>
+                <w:rFonts w:cs="Arial"/>
+                <w:b/>
+                <w:sz w:val="28"/>
+                <w:szCs w:val="32"/>
+                <w:lang w:val="it-IT"/>
+              </w:rPr>
+              <w:t>2</w:t>
+            </w:r>
+            <w:r>
+              <w:rPr>
+                <w:rFonts w:cs="Arial"/>
+                <w:b/>
+                <w:sz w:val="28"/>
+                <w:szCs w:val="32"/>
+                <w:lang w:val="it-IT"/>
+              </w:rPr>
+              <w:t>9</w:t>
+            </w:r>
+          </w:p>
+        </w:tc>
+        <w:tc>
+          <w:tcPr>
+            <w:tcW w:w="5103" w:type="dxa"/>
+          </w:tcPr>
+          <w:p>
+            <w:pPr>
+              <w:widowControl w:val="0"/>
+              <w:autoSpaceDE w:val="0"/>
+              <w:autoSpaceDN w:val="0"/>
+              <w:adjustRightInd w:val="0"/>
+              <w:spacing w:before="0" w:line="240" w:lineRule="auto"/>
+              <w:rPr>
+                <w:rFonts w:ascii="BRH Malayalam Extra" w:eastAsia="Times New Roman" w:hAnsi="BRH Malayalam Extra" w:cs="BRH Malayalam Extra"/>
+                <w:color w:val="000000"/>
+                <w:sz w:val="40"/>
+                <w:szCs w:val="40"/>
+                <w:lang w:val="en-IN" w:eastAsia="en-IN" w:bidi="ml-IN"/>
+              </w:rPr>
+            </w:pPr>
+            <w:r>
+              <w:rPr>
+                <w:rFonts w:ascii="BRH Malayalam Extra" w:eastAsia="Times New Roman" w:hAnsi="BRH Malayalam Extra" w:cs="BRH Malayalam Extra"/>
+                <w:color w:val="000000"/>
+                <w:sz w:val="40"/>
+                <w:szCs w:val="40"/>
+                <w:lang w:val="en-IN" w:eastAsia="en-IN" w:bidi="ml-IN"/>
+              </w:rPr>
+              <w:t>ögx</w:t>
+            </w:r>
+            <w:r>
+              <w:rPr>
+                <w:rFonts w:ascii="BRH Malayalam Extra" w:eastAsia="Times New Roman" w:hAnsi="BRH Malayalam Extra" w:cs="BRH Malayalam Extra"/>
+                <w:color w:val="000000"/>
+                <w:sz w:val="40"/>
+                <w:szCs w:val="40"/>
+                <w:lang w:val="en-IN" w:eastAsia="en-IN" w:bidi="ml-IN"/>
+              </w:rPr>
+              <w:t>Ö</w:t>
+            </w:r>
+            <w:r>
+              <w:rPr>
+                <w:rFonts w:ascii="BRH Malayalam Extra" w:eastAsia="Times New Roman" w:hAnsi="BRH Malayalam Extra" w:cs="BRH Malayalam Extra"/>
+                <w:color w:val="000000"/>
+                <w:sz w:val="40"/>
+                <w:szCs w:val="40"/>
+                <w:highlight w:val="yellow"/>
+                <w:lang w:val="en-IN" w:eastAsia="en-IN" w:bidi="ml-IN"/>
+              </w:rPr>
+              <w:t>—dx</w:t>
+            </w:r>
+            <w:r>
+              <w:rPr>
+                <w:rFonts w:ascii="BRH Malayalam Extra" w:eastAsia="Times New Roman" w:hAnsi="BRH Malayalam Extra" w:cs="BRH Malayalam Extra"/>
+                <w:color w:val="000000"/>
+                <w:sz w:val="40"/>
+                <w:szCs w:val="40"/>
+                <w:lang w:val="en-IN" w:eastAsia="en-IN" w:bidi="ml-IN"/>
+              </w:rPr>
+              <w:t>s</w:t>
+            </w:r>
+            <w:r>
+              <w:rPr>
+                <w:rFonts w:ascii="BRH Malayalam Extra" w:eastAsia="Times New Roman" w:hAnsi="BRH Malayalam Extra" w:cs="BRH Malayalam Extra"/>
+                <w:color w:val="000000"/>
+                <w:sz w:val="32"/>
+                <w:szCs w:val="40"/>
+                <w:lang w:val="en-IN" w:eastAsia="en-IN" w:bidi="ml-IN"/>
+              </w:rPr>
+              <w:t>–</w:t>
+            </w:r>
+            <w:r>
+              <w:rPr>
+                <w:rFonts w:ascii="BRH Malayalam Extra" w:eastAsia="Times New Roman" w:hAnsi="BRH Malayalam Extra" w:cs="BRH Malayalam Extra"/>
+                <w:color w:val="000000"/>
+                <w:sz w:val="40"/>
+                <w:szCs w:val="40"/>
+                <w:lang w:val="en-IN" w:eastAsia="en-IN" w:bidi="ml-IN"/>
+              </w:rPr>
+              <w:t>J eyZ—kJ |</w:t>
+            </w:r>
+          </w:p>
+        </w:tc>
+        <w:tc>
+          <w:tcPr>
+            <w:tcW w:w="5386" w:type="dxa"/>
+          </w:tcPr>
+          <w:p>
+            <w:pPr>
+              <w:widowControl w:val="0"/>
+              <w:autoSpaceDE w:val="0"/>
+              <w:autoSpaceDN w:val="0"/>
+              <w:adjustRightInd w:val="0"/>
+              <w:spacing w:before="0" w:line="240" w:lineRule="auto"/>
+              <w:rPr>
+                <w:rFonts w:ascii="BRH Malayalam Extra" w:eastAsia="Times New Roman" w:hAnsi="BRH Malayalam Extra" w:cs="BRH Malayalam Extra"/>
+                <w:color w:val="000000"/>
+                <w:sz w:val="40"/>
+                <w:szCs w:val="40"/>
+                <w:lang w:eastAsia="en-IN" w:bidi="ml-IN"/>
+              </w:rPr>
+            </w:pPr>
+            <w:r>
+              <w:rPr>
+                <w:rFonts w:ascii="BRH Malayalam Extra" w:eastAsia="Times New Roman" w:hAnsi="BRH Malayalam Extra" w:cs="BRH Malayalam Extra"/>
+                <w:color w:val="000000"/>
+                <w:sz w:val="40"/>
+                <w:szCs w:val="40"/>
+                <w:lang w:val="en-IN" w:eastAsia="en-IN" w:bidi="ml-IN"/>
+              </w:rPr>
+              <w:t>ögxÖ—</w:t>
+            </w:r>
+            <w:r>
+              <w:rPr>
+                <w:rFonts w:ascii="BRH Malayalam Extra" w:hAnsi="BRH Malayalam Extra" w:cs="BRH Malayalam Extra"/>
+                <w:sz w:val="40"/>
+                <w:szCs w:val="40"/>
+                <w:highlight w:val="green"/>
+              </w:rPr>
+              <w:t>Y</w:t>
+            </w:r>
+            <w:r>
+              <w:rPr>
+                <w:rFonts w:ascii="BRH Malayalam Extra" w:hAnsi="BRH Malayalam Extra" w:cs="BRH Malayalam Extra"/>
+                <w:sz w:val="40"/>
+                <w:szCs w:val="40"/>
+              </w:rPr>
+              <w:t>x</w:t>
+            </w:r>
+            <w:r>
+              <w:rPr>
+                <w:rFonts w:ascii="BRH Malayalam Extra" w:eastAsia="Times New Roman" w:hAnsi="BRH Malayalam Extra" w:cs="BRH Malayalam Extra"/>
+                <w:color w:val="000000"/>
+                <w:sz w:val="40"/>
+                <w:szCs w:val="40"/>
+                <w:lang w:val="en-IN" w:eastAsia="en-IN" w:bidi="ml-IN"/>
+              </w:rPr>
+              <w:t>s</w:t>
+            </w:r>
+            <w:r>
+              <w:rPr>
+                <w:rFonts w:ascii="BRH Malayalam Extra" w:eastAsia="Times New Roman" w:hAnsi="BRH Malayalam Extra" w:cs="BRH Malayalam Extra"/>
+                <w:color w:val="000000"/>
+                <w:sz w:val="32"/>
+                <w:szCs w:val="40"/>
+                <w:lang w:val="en-IN" w:eastAsia="en-IN" w:bidi="ml-IN"/>
+              </w:rPr>
+              <w:t>–</w:t>
+            </w:r>
+            <w:r>
+              <w:rPr>
+                <w:rFonts w:ascii="BRH Malayalam Extra" w:eastAsia="Times New Roman" w:hAnsi="BRH Malayalam Extra" w:cs="BRH Malayalam Extra"/>
+                <w:color w:val="000000"/>
+                <w:sz w:val="40"/>
+                <w:szCs w:val="40"/>
+                <w:lang w:val="en-IN" w:eastAsia="en-IN" w:bidi="ml-IN"/>
+              </w:rPr>
+              <w:t>J eyZ—kJ |</w:t>
+            </w:r>
+          </w:p>
+        </w:tc>
+      </w:tr>
+      <w:tr>
+        <w:trPr>
+          <w:trHeight w:val="1437"/>
+        </w:trPr>
+        <w:tc>
+          <w:tcPr>
+            <w:tcW w:w="3906" w:type="dxa"/>
+          </w:tcPr>
+          <w:p>
+            <w:pPr>
+              <w:widowControl w:val="0"/>
+              <w:tabs>
+                <w:tab w:val="left" w:pos="993"/>
+              </w:tabs>
+              <w:autoSpaceDE w:val="0"/>
+              <w:autoSpaceDN w:val="0"/>
+              <w:adjustRightInd w:val="0"/>
               <w:spacing w:before="0" w:line="252" w:lineRule="auto"/>
               <w:ind w:right="297"/>
               <w:rPr>
@@ -2482,7 +3234,6 @@
                 <w:sz w:val="28"/>
                 <w:szCs w:val="32"/>
               </w:rPr>
-              <w:lastRenderedPageBreak/>
               <w:t>T.S.4.6.</w:t>
             </w:r>
             <w:r>
@@ -3556,6 +4307,7 @@
                 <w:szCs w:val="40"/>
                 <w:lang w:val="en-IN" w:eastAsia="en-IN" w:bidi="ml-IN"/>
               </w:rPr>
+              <w:lastRenderedPageBreak/>
               <w:t>¥K</w:t>
             </w:r>
             <w:r>
@@ -3703,6 +4455,7 @@
                 <w:szCs w:val="40"/>
                 <w:lang w:val="en-IN" w:eastAsia="en-IN" w:bidi="ml-IN"/>
               </w:rPr>
+              <w:lastRenderedPageBreak/>
               <w:t>¥K</w:t>
             </w:r>
             <w:r>
@@ -3801,6 +4554,7 @@
                 <w:szCs w:val="40"/>
                 <w:lang w:val="en-IN" w:eastAsia="en-IN" w:bidi="ml-IN"/>
               </w:rPr>
+              <w:lastRenderedPageBreak/>
               <w:t>¥K</w:t>
             </w:r>
             <w:r>
@@ -3942,6 +4696,7 @@
           <w:szCs w:val="32"/>
           <w:u w:val="single"/>
         </w:rPr>
+        <w:lastRenderedPageBreak/>
         <w:t>=========</w:t>
       </w:r>
     </w:p>
@@ -4112,7 +4867,6 @@
                 <w:sz w:val="32"/>
                 <w:szCs w:val="32"/>
               </w:rPr>
-              <w:lastRenderedPageBreak/>
               <w:t>Section, Paragraph</w:t>
             </w:r>
           </w:p>
@@ -5652,6 +6406,7 @@
                 <w:sz w:val="28"/>
                 <w:szCs w:val="32"/>
               </w:rPr>
+              <w:lastRenderedPageBreak/>
               <w:t>T.S.4.6.6.7 – Kramam</w:t>
             </w:r>
           </w:p>
@@ -6459,7 +7214,6 @@
                 <w:sz w:val="28"/>
                 <w:szCs w:val="32"/>
               </w:rPr>
-              <w:lastRenderedPageBreak/>
               <w:t>T.S.4.6.7.4 – Kramam</w:t>
             </w:r>
           </w:p>
@@ -8131,6 +8885,7 @@
                 <w:sz w:val="28"/>
                 <w:szCs w:val="32"/>
               </w:rPr>
+              <w:lastRenderedPageBreak/>
               <w:t>T.S.4.6.9.1 – Kramam</w:t>
             </w:r>
           </w:p>
@@ -8684,16 +9439,7 @@
           <w:bCs/>
           <w:sz w:val="32"/>
         </w:rPr>
-        <w:t xml:space="preserve">replaced </w:t>
-      </w:r>
-      <w:proofErr w:type="gramStart"/>
-      <w:r>
-        <w:rPr>
-          <w:b/>
-          <w:bCs/>
-          <w:sz w:val="32"/>
-        </w:rPr>
-        <w:t>with</w:t>
+        <w:t>replaced with</w:t>
       </w:r>
       <w:r>
         <w:rPr>
@@ -8715,7 +9461,6 @@
         </w:rPr>
         <w:t>"</w:t>
       </w:r>
-      <w:proofErr w:type="gramEnd"/>
       <w:r>
         <w:rPr>
           <w:rFonts w:ascii="BRH Malayalam" w:hAnsi="BRH Malayalam" w:cs="BRH Malayalam"/>
@@ -8727,7 +9472,6 @@
         </w:rPr>
         <w:t>q§T</w:t>
       </w:r>
-      <w:proofErr w:type="gramStart"/>
       <w:r>
         <w:rPr>
           <w:rFonts w:ascii="BRH Malayalam" w:hAnsi="BRH Malayalam" w:cs="BRH Malayalam"/>
@@ -8744,16 +9488,7 @@
           <w:bCs/>
           <w:sz w:val="32"/>
         </w:rPr>
-        <w:t>wherever</w:t>
-      </w:r>
-      <w:proofErr w:type="gramEnd"/>
-      <w:r>
-        <w:rPr>
-          <w:b/>
-          <w:bCs/>
-          <w:sz w:val="32"/>
-        </w:rPr>
-        <w:t xml:space="preserve"> applicable</w:t>
+        <w:t>wherever applicable</w:t>
       </w:r>
     </w:p>
     <w:p>
@@ -8775,7 +9510,6 @@
           <w:szCs w:val="32"/>
           <w:u w:val="single"/>
         </w:rPr>
-        <w:lastRenderedPageBreak/>
         <w:t>=============</w:t>
       </w:r>
     </w:p>

</xml_diff>